<commit_message>
CORRECTED PROV_TOT and re-knit all global
</commit_message>
<xml_diff>
--- a/Extracted_data_analysis/polar/Mesophotic_methods_Systematic_lit_rev_polar.docx
+++ b/Extracted_data_analysis/polar/Mesophotic_methods_Systematic_lit_rev_polar.docx
@@ -23,7 +23,7 @@
         <w:pStyle w:val="Date"/>
       </w:pPr>
       <w:r>
-        <w:t>2026-05-28</w:t>
+        <w:t>2026-06-18</w:t>
       </w:r>
     </w:p>
     <w:sdt>
@@ -34,7 +34,7 @@
           <w:sz w:val="24"/>
           <w:szCs w:val="24"/>
         </w:rPr>
-        <w:id w:val="877893544"/>
+        <w:id w:val="-1196696059"/>
         <w:docPartObj>
           <w:docPartGallery w:val="Table of Contents"/>
           <w:docPartUnique/>
@@ -71,7 +71,7 @@
           <w:r>
             <w:fldChar w:fldCharType="separate"/>
           </w:r>
-          <w:hyperlink w:anchor="_Toc230857754" w:history="1">
+          <w:hyperlink w:anchor="_Toc232696721" w:history="1">
             <w:r>
               <w:rPr>
                 <w:rStyle w:val="Hyperlink"/>
@@ -98,7 +98,7 @@
                 <w:noProof/>
                 <w:webHidden/>
               </w:rPr>
-              <w:instrText xml:space="preserve"> PAGEREF _Toc230857754 \h </w:instrText>
+              <w:instrText xml:space="preserve"> PAGEREF _Toc232696721 \h </w:instrText>
             </w:r>
             <w:r>
               <w:rPr>
@@ -142,7 +142,7 @@
               <w14:ligatures w14:val="standardContextual"/>
             </w:rPr>
           </w:pPr>
-          <w:hyperlink w:anchor="_Toc230857755" w:history="1">
+          <w:hyperlink w:anchor="_Toc232696722" w:history="1">
             <w:r>
               <w:rPr>
                 <w:rStyle w:val="Hyperlink"/>
@@ -169,7 +169,7 @@
                 <w:noProof/>
                 <w:webHidden/>
               </w:rPr>
-              <w:instrText xml:space="preserve"> PAGEREF _Toc230857755 \h </w:instrText>
+              <w:instrText xml:space="preserve"> PAGEREF _Toc232696722 \h </w:instrText>
             </w:r>
             <w:r>
               <w:rPr>
@@ -213,7 +213,7 @@
               <w14:ligatures w14:val="standardContextual"/>
             </w:rPr>
           </w:pPr>
-          <w:hyperlink w:anchor="_Toc230857756" w:history="1">
+          <w:hyperlink w:anchor="_Toc232696723" w:history="1">
             <w:r>
               <w:rPr>
                 <w:rStyle w:val="Hyperlink"/>
@@ -240,7 +240,7 @@
                 <w:noProof/>
                 <w:webHidden/>
               </w:rPr>
-              <w:instrText xml:space="preserve"> PAGEREF _Toc230857756 \h </w:instrText>
+              <w:instrText xml:space="preserve"> PAGEREF _Toc232696723 \h </w:instrText>
             </w:r>
             <w:r>
               <w:rPr>
@@ -284,7 +284,7 @@
               <w14:ligatures w14:val="standardContextual"/>
             </w:rPr>
           </w:pPr>
-          <w:hyperlink w:anchor="_Toc230857757" w:history="1">
+          <w:hyperlink w:anchor="_Toc232696724" w:history="1">
             <w:r>
               <w:rPr>
                 <w:rStyle w:val="Hyperlink"/>
@@ -311,7 +311,7 @@
                 <w:noProof/>
                 <w:webHidden/>
               </w:rPr>
-              <w:instrText xml:space="preserve"> PAGEREF _Toc230857757 \h </w:instrText>
+              <w:instrText xml:space="preserve"> PAGEREF _Toc232696724 \h </w:instrText>
             </w:r>
             <w:r>
               <w:rPr>
@@ -355,7 +355,7 @@
               <w14:ligatures w14:val="standardContextual"/>
             </w:rPr>
           </w:pPr>
-          <w:hyperlink w:anchor="_Toc230857758" w:history="1">
+          <w:hyperlink w:anchor="_Toc232696725" w:history="1">
             <w:r>
               <w:rPr>
                 <w:rStyle w:val="Hyperlink"/>
@@ -382,7 +382,7 @@
                 <w:noProof/>
                 <w:webHidden/>
               </w:rPr>
-              <w:instrText xml:space="preserve"> PAGEREF _Toc230857758 \h </w:instrText>
+              <w:instrText xml:space="preserve"> PAGEREF _Toc232696725 \h </w:instrText>
             </w:r>
             <w:r>
               <w:rPr>
@@ -426,7 +426,7 @@
               <w14:ligatures w14:val="standardContextual"/>
             </w:rPr>
           </w:pPr>
-          <w:hyperlink w:anchor="_Toc230857759" w:history="1">
+          <w:hyperlink w:anchor="_Toc232696726" w:history="1">
             <w:r>
               <w:rPr>
                 <w:rStyle w:val="Hyperlink"/>
@@ -453,7 +453,7 @@
                 <w:noProof/>
                 <w:webHidden/>
               </w:rPr>
-              <w:instrText xml:space="preserve"> PAGEREF _Toc230857759 \h </w:instrText>
+              <w:instrText xml:space="preserve"> PAGEREF _Toc232696726 \h </w:instrText>
             </w:r>
             <w:r>
               <w:rPr>
@@ -497,7 +497,7 @@
               <w14:ligatures w14:val="standardContextual"/>
             </w:rPr>
           </w:pPr>
-          <w:hyperlink w:anchor="_Toc230857760" w:history="1">
+          <w:hyperlink w:anchor="_Toc232696727" w:history="1">
             <w:r>
               <w:rPr>
                 <w:rStyle w:val="Hyperlink"/>
@@ -524,7 +524,7 @@
                 <w:noProof/>
                 <w:webHidden/>
               </w:rPr>
-              <w:instrText xml:space="preserve"> PAGEREF _Toc230857760 \h </w:instrText>
+              <w:instrText xml:space="preserve"> PAGEREF _Toc232696727 \h </w:instrText>
             </w:r>
             <w:r>
               <w:rPr>
@@ -568,7 +568,7 @@
               <w14:ligatures w14:val="standardContextual"/>
             </w:rPr>
           </w:pPr>
-          <w:hyperlink w:anchor="_Toc230857761" w:history="1">
+          <w:hyperlink w:anchor="_Toc232696728" w:history="1">
             <w:r>
               <w:rPr>
                 <w:rStyle w:val="Hyperlink"/>
@@ -595,7 +595,7 @@
                 <w:noProof/>
                 <w:webHidden/>
               </w:rPr>
-              <w:instrText xml:space="preserve"> PAGEREF _Toc230857761 \h </w:instrText>
+              <w:instrText xml:space="preserve"> PAGEREF _Toc232696728 \h </w:instrText>
             </w:r>
             <w:r>
               <w:rPr>
@@ -639,7 +639,7 @@
               <w14:ligatures w14:val="standardContextual"/>
             </w:rPr>
           </w:pPr>
-          <w:hyperlink w:anchor="_Toc230857762" w:history="1">
+          <w:hyperlink w:anchor="_Toc232696729" w:history="1">
             <w:r>
               <w:rPr>
                 <w:rStyle w:val="Hyperlink"/>
@@ -666,7 +666,7 @@
                 <w:noProof/>
                 <w:webHidden/>
               </w:rPr>
-              <w:instrText xml:space="preserve"> PAGEREF _Toc230857762 \h </w:instrText>
+              <w:instrText xml:space="preserve"> PAGEREF _Toc232696729 \h </w:instrText>
             </w:r>
             <w:r>
               <w:rPr>
@@ -710,7 +710,7 @@
               <w14:ligatures w14:val="standardContextual"/>
             </w:rPr>
           </w:pPr>
-          <w:hyperlink w:anchor="_Toc230857763" w:history="1">
+          <w:hyperlink w:anchor="_Toc232696730" w:history="1">
             <w:r>
               <w:rPr>
                 <w:rStyle w:val="Hyperlink"/>
@@ -737,7 +737,7 @@
                 <w:noProof/>
                 <w:webHidden/>
               </w:rPr>
-              <w:instrText xml:space="preserve"> PAGEREF _Toc230857763 \h </w:instrText>
+              <w:instrText xml:space="preserve"> PAGEREF _Toc232696730 \h </w:instrText>
             </w:r>
             <w:r>
               <w:rPr>
@@ -781,7 +781,7 @@
               <w14:ligatures w14:val="standardContextual"/>
             </w:rPr>
           </w:pPr>
-          <w:hyperlink w:anchor="_Toc230857764" w:history="1">
+          <w:hyperlink w:anchor="_Toc232696731" w:history="1">
             <w:r>
               <w:rPr>
                 <w:rStyle w:val="Hyperlink"/>
@@ -808,7 +808,7 @@
                 <w:noProof/>
                 <w:webHidden/>
               </w:rPr>
-              <w:instrText xml:space="preserve"> PAGEREF _Toc230857764 \h </w:instrText>
+              <w:instrText xml:space="preserve"> PAGEREF _Toc232696731 \h </w:instrText>
             </w:r>
             <w:r>
               <w:rPr>
@@ -852,7 +852,7 @@
               <w14:ligatures w14:val="standardContextual"/>
             </w:rPr>
           </w:pPr>
-          <w:hyperlink w:anchor="_Toc230857765" w:history="1">
+          <w:hyperlink w:anchor="_Toc232696732" w:history="1">
             <w:r>
               <w:rPr>
                 <w:rStyle w:val="Hyperlink"/>
@@ -879,7 +879,7 @@
                 <w:noProof/>
                 <w:webHidden/>
               </w:rPr>
-              <w:instrText xml:space="preserve"> PAGEREF _Toc230857765 \h </w:instrText>
+              <w:instrText xml:space="preserve"> PAGEREF _Toc232696732 \h </w:instrText>
             </w:r>
             <w:r>
               <w:rPr>
@@ -923,7 +923,7 @@
               <w14:ligatures w14:val="standardContextual"/>
             </w:rPr>
           </w:pPr>
-          <w:hyperlink w:anchor="_Toc230857766" w:history="1">
+          <w:hyperlink w:anchor="_Toc232696733" w:history="1">
             <w:r>
               <w:rPr>
                 <w:rStyle w:val="Hyperlink"/>
@@ -950,7 +950,7 @@
                 <w:noProof/>
                 <w:webHidden/>
               </w:rPr>
-              <w:instrText xml:space="preserve"> PAGEREF _Toc230857766 \h </w:instrText>
+              <w:instrText xml:space="preserve"> PAGEREF _Toc232696733 \h </w:instrText>
             </w:r>
             <w:r>
               <w:rPr>
@@ -994,7 +994,7 @@
               <w14:ligatures w14:val="standardContextual"/>
             </w:rPr>
           </w:pPr>
-          <w:hyperlink w:anchor="_Toc230857767" w:history="1">
+          <w:hyperlink w:anchor="_Toc232696734" w:history="1">
             <w:r>
               <w:rPr>
                 <w:rStyle w:val="Hyperlink"/>
@@ -1021,7 +1021,7 @@
                 <w:noProof/>
                 <w:webHidden/>
               </w:rPr>
-              <w:instrText xml:space="preserve"> PAGEREF _Toc230857767 \h </w:instrText>
+              <w:instrText xml:space="preserve"> PAGEREF _Toc232696734 \h </w:instrText>
             </w:r>
             <w:r>
               <w:rPr>
@@ -1065,7 +1065,7 @@
               <w14:ligatures w14:val="standardContextual"/>
             </w:rPr>
           </w:pPr>
-          <w:hyperlink w:anchor="_Toc230857768" w:history="1">
+          <w:hyperlink w:anchor="_Toc232696735" w:history="1">
             <w:r>
               <w:rPr>
                 <w:rStyle w:val="Hyperlink"/>
@@ -1092,7 +1092,7 @@
                 <w:noProof/>
                 <w:webHidden/>
               </w:rPr>
-              <w:instrText xml:space="preserve"> PAGEREF _Toc230857768 \h </w:instrText>
+              <w:instrText xml:space="preserve"> PAGEREF _Toc232696735 \h </w:instrText>
             </w:r>
             <w:r>
               <w:rPr>
@@ -1136,7 +1136,7 @@
               <w14:ligatures w14:val="standardContextual"/>
             </w:rPr>
           </w:pPr>
-          <w:hyperlink w:anchor="_Toc230857769" w:history="1">
+          <w:hyperlink w:anchor="_Toc232696736" w:history="1">
             <w:r>
               <w:rPr>
                 <w:rStyle w:val="Hyperlink"/>
@@ -1163,7 +1163,7 @@
                 <w:noProof/>
                 <w:webHidden/>
               </w:rPr>
-              <w:instrText xml:space="preserve"> PAGEREF _Toc230857769 \h </w:instrText>
+              <w:instrText xml:space="preserve"> PAGEREF _Toc232696736 \h </w:instrText>
             </w:r>
             <w:r>
               <w:rPr>
@@ -1207,7 +1207,7 @@
               <w14:ligatures w14:val="standardContextual"/>
             </w:rPr>
           </w:pPr>
-          <w:hyperlink w:anchor="_Toc230857770" w:history="1">
+          <w:hyperlink w:anchor="_Toc232696737" w:history="1">
             <w:r>
               <w:rPr>
                 <w:rStyle w:val="Hyperlink"/>
@@ -1234,7 +1234,7 @@
                 <w:noProof/>
                 <w:webHidden/>
               </w:rPr>
-              <w:instrText xml:space="preserve"> PAGEREF _Toc230857770 \h </w:instrText>
+              <w:instrText xml:space="preserve"> PAGEREF _Toc232696737 \h </w:instrText>
             </w:r>
             <w:r>
               <w:rPr>
@@ -1278,7 +1278,7 @@
               <w14:ligatures w14:val="standardContextual"/>
             </w:rPr>
           </w:pPr>
-          <w:hyperlink w:anchor="_Toc230857771" w:history="1">
+          <w:hyperlink w:anchor="_Toc232696738" w:history="1">
             <w:r>
               <w:rPr>
                 <w:rStyle w:val="Hyperlink"/>
@@ -1305,7 +1305,7 @@
                 <w:noProof/>
                 <w:webHidden/>
               </w:rPr>
-              <w:instrText xml:space="preserve"> PAGEREF _Toc230857771 \h </w:instrText>
+              <w:instrText xml:space="preserve"> PAGEREF _Toc232696738 \h </w:instrText>
             </w:r>
             <w:r>
               <w:rPr>
@@ -1349,7 +1349,7 @@
               <w14:ligatures w14:val="standardContextual"/>
             </w:rPr>
           </w:pPr>
-          <w:hyperlink w:anchor="_Toc230857772" w:history="1">
+          <w:hyperlink w:anchor="_Toc232696739" w:history="1">
             <w:r>
               <w:rPr>
                 <w:rStyle w:val="Hyperlink"/>
@@ -1376,7 +1376,7 @@
                 <w:noProof/>
                 <w:webHidden/>
               </w:rPr>
-              <w:instrText xml:space="preserve"> PAGEREF _Toc230857772 \h </w:instrText>
+              <w:instrText xml:space="preserve"> PAGEREF _Toc232696739 \h </w:instrText>
             </w:r>
             <w:r>
               <w:rPr>
@@ -1420,7 +1420,7 @@
               <w14:ligatures w14:val="standardContextual"/>
             </w:rPr>
           </w:pPr>
-          <w:hyperlink w:anchor="_Toc230857773" w:history="1">
+          <w:hyperlink w:anchor="_Toc232696740" w:history="1">
             <w:r>
               <w:rPr>
                 <w:rStyle w:val="Hyperlink"/>
@@ -1447,7 +1447,7 @@
                 <w:noProof/>
                 <w:webHidden/>
               </w:rPr>
-              <w:instrText xml:space="preserve"> PAGEREF _Toc230857773 \h </w:instrText>
+              <w:instrText xml:space="preserve"> PAGEREF _Toc232696740 \h </w:instrText>
             </w:r>
             <w:r>
               <w:rPr>
@@ -1491,7 +1491,7 @@
               <w14:ligatures w14:val="standardContextual"/>
             </w:rPr>
           </w:pPr>
-          <w:hyperlink w:anchor="_Toc230857774" w:history="1">
+          <w:hyperlink w:anchor="_Toc232696741" w:history="1">
             <w:r>
               <w:rPr>
                 <w:rStyle w:val="Hyperlink"/>
@@ -1518,7 +1518,7 @@
                 <w:noProof/>
                 <w:webHidden/>
               </w:rPr>
-              <w:instrText xml:space="preserve"> PAGEREF _Toc230857774 \h </w:instrText>
+              <w:instrText xml:space="preserve"> PAGEREF _Toc232696741 \h </w:instrText>
             </w:r>
             <w:r>
               <w:rPr>
@@ -1562,7 +1562,7 @@
               <w14:ligatures w14:val="standardContextual"/>
             </w:rPr>
           </w:pPr>
-          <w:hyperlink w:anchor="_Toc230857775" w:history="1">
+          <w:hyperlink w:anchor="_Toc232696742" w:history="1">
             <w:r>
               <w:rPr>
                 <w:rStyle w:val="Hyperlink"/>
@@ -1589,7 +1589,7 @@
                 <w:noProof/>
                 <w:webHidden/>
               </w:rPr>
-              <w:instrText xml:space="preserve"> PAGEREF _Toc230857775 \h </w:instrText>
+              <w:instrText xml:space="preserve"> PAGEREF _Toc232696742 \h </w:instrText>
             </w:r>
             <w:r>
               <w:rPr>
@@ -1633,7 +1633,7 @@
               <w14:ligatures w14:val="standardContextual"/>
             </w:rPr>
           </w:pPr>
-          <w:hyperlink w:anchor="_Toc230857776" w:history="1">
+          <w:hyperlink w:anchor="_Toc232696743" w:history="1">
             <w:r>
               <w:rPr>
                 <w:rStyle w:val="Hyperlink"/>
@@ -1660,7 +1660,7 @@
                 <w:noProof/>
                 <w:webHidden/>
               </w:rPr>
-              <w:instrText xml:space="preserve"> PAGEREF _Toc230857776 \h </w:instrText>
+              <w:instrText xml:space="preserve"> PAGEREF _Toc232696743 \h </w:instrText>
             </w:r>
             <w:r>
               <w:rPr>
@@ -1704,7 +1704,7 @@
               <w14:ligatures w14:val="standardContextual"/>
             </w:rPr>
           </w:pPr>
-          <w:hyperlink w:anchor="_Toc230857777" w:history="1">
+          <w:hyperlink w:anchor="_Toc232696744" w:history="1">
             <w:r>
               <w:rPr>
                 <w:rStyle w:val="Hyperlink"/>
@@ -1731,7 +1731,7 @@
                 <w:noProof/>
                 <w:webHidden/>
               </w:rPr>
-              <w:instrText xml:space="preserve"> PAGEREF _Toc230857777 \h </w:instrText>
+              <w:instrText xml:space="preserve"> PAGEREF _Toc232696744 \h </w:instrText>
             </w:r>
             <w:r>
               <w:rPr>
@@ -1775,7 +1775,7 @@
               <w14:ligatures w14:val="standardContextual"/>
             </w:rPr>
           </w:pPr>
-          <w:hyperlink w:anchor="_Toc230857778" w:history="1">
+          <w:hyperlink w:anchor="_Toc232696745" w:history="1">
             <w:r>
               <w:rPr>
                 <w:rStyle w:val="Hyperlink"/>
@@ -1802,7 +1802,7 @@
                 <w:noProof/>
                 <w:webHidden/>
               </w:rPr>
-              <w:instrText xml:space="preserve"> PAGEREF _Toc230857778 \h </w:instrText>
+              <w:instrText xml:space="preserve"> PAGEREF _Toc232696745 \h </w:instrText>
             </w:r>
             <w:r>
               <w:rPr>
@@ -1846,7 +1846,7 @@
               <w14:ligatures w14:val="standardContextual"/>
             </w:rPr>
           </w:pPr>
-          <w:hyperlink w:anchor="_Toc230857779" w:history="1">
+          <w:hyperlink w:anchor="_Toc232696746" w:history="1">
             <w:r>
               <w:rPr>
                 <w:rStyle w:val="Hyperlink"/>
@@ -1873,7 +1873,7 @@
                 <w:noProof/>
                 <w:webHidden/>
               </w:rPr>
-              <w:instrText xml:space="preserve"> PAGEREF _Toc230857779 \h </w:instrText>
+              <w:instrText xml:space="preserve"> PAGEREF _Toc232696746 \h </w:instrText>
             </w:r>
             <w:r>
               <w:rPr>
@@ -1917,7 +1917,7 @@
               <w14:ligatures w14:val="standardContextual"/>
             </w:rPr>
           </w:pPr>
-          <w:hyperlink w:anchor="_Toc230857780" w:history="1">
+          <w:hyperlink w:anchor="_Toc232696747" w:history="1">
             <w:r>
               <w:rPr>
                 <w:rStyle w:val="Hyperlink"/>
@@ -1944,7 +1944,7 @@
                 <w:noProof/>
                 <w:webHidden/>
               </w:rPr>
-              <w:instrText xml:space="preserve"> PAGEREF _Toc230857780 \h </w:instrText>
+              <w:instrText xml:space="preserve"> PAGEREF _Toc232696747 \h </w:instrText>
             </w:r>
             <w:r>
               <w:rPr>
@@ -1988,7 +1988,7 @@
               <w14:ligatures w14:val="standardContextual"/>
             </w:rPr>
           </w:pPr>
-          <w:hyperlink w:anchor="_Toc230857781" w:history="1">
+          <w:hyperlink w:anchor="_Toc232696748" w:history="1">
             <w:r>
               <w:rPr>
                 <w:rStyle w:val="Hyperlink"/>
@@ -2015,7 +2015,7 @@
                 <w:noProof/>
                 <w:webHidden/>
               </w:rPr>
-              <w:instrText xml:space="preserve"> PAGEREF _Toc230857781 \h </w:instrText>
+              <w:instrText xml:space="preserve"> PAGEREF _Toc232696748 \h </w:instrText>
             </w:r>
             <w:r>
               <w:rPr>
@@ -2059,7 +2059,7 @@
               <w14:ligatures w14:val="standardContextual"/>
             </w:rPr>
           </w:pPr>
-          <w:hyperlink w:anchor="_Toc230857782" w:history="1">
+          <w:hyperlink w:anchor="_Toc232696749" w:history="1">
             <w:r>
               <w:rPr>
                 <w:rStyle w:val="Hyperlink"/>
@@ -2086,7 +2086,7 @@
                 <w:noProof/>
                 <w:webHidden/>
               </w:rPr>
-              <w:instrText xml:space="preserve"> PAGEREF _Toc230857782 \h </w:instrText>
+              <w:instrText xml:space="preserve"> PAGEREF _Toc232696749 \h </w:instrText>
             </w:r>
             <w:r>
               <w:rPr>
@@ -2130,7 +2130,7 @@
               <w14:ligatures w14:val="standardContextual"/>
             </w:rPr>
           </w:pPr>
-          <w:hyperlink w:anchor="_Toc230857783" w:history="1">
+          <w:hyperlink w:anchor="_Toc232696750" w:history="1">
             <w:r>
               <w:rPr>
                 <w:rStyle w:val="Hyperlink"/>
@@ -2157,7 +2157,7 @@
                 <w:noProof/>
                 <w:webHidden/>
               </w:rPr>
-              <w:instrText xml:space="preserve"> PAGEREF _Toc230857783 \h </w:instrText>
+              <w:instrText xml:space="preserve"> PAGEREF _Toc232696750 \h </w:instrText>
             </w:r>
             <w:r>
               <w:rPr>
@@ -2201,7 +2201,7 @@
               <w14:ligatures w14:val="standardContextual"/>
             </w:rPr>
           </w:pPr>
-          <w:hyperlink w:anchor="_Toc230857784" w:history="1">
+          <w:hyperlink w:anchor="_Toc232696751" w:history="1">
             <w:r>
               <w:rPr>
                 <w:rStyle w:val="Hyperlink"/>
@@ -2228,7 +2228,7 @@
                 <w:noProof/>
                 <w:webHidden/>
               </w:rPr>
-              <w:instrText xml:space="preserve"> PAGEREF _Toc230857784 \h </w:instrText>
+              <w:instrText xml:space="preserve"> PAGEREF _Toc232696751 \h </w:instrText>
             </w:r>
             <w:r>
               <w:rPr>
@@ -2272,7 +2272,7 @@
               <w14:ligatures w14:val="standardContextual"/>
             </w:rPr>
           </w:pPr>
-          <w:hyperlink w:anchor="_Toc230857785" w:history="1">
+          <w:hyperlink w:anchor="_Toc232696752" w:history="1">
             <w:r>
               <w:rPr>
                 <w:rStyle w:val="Hyperlink"/>
@@ -2299,7 +2299,7 @@
                 <w:noProof/>
                 <w:webHidden/>
               </w:rPr>
-              <w:instrText xml:space="preserve"> PAGEREF _Toc230857785 \h </w:instrText>
+              <w:instrText xml:space="preserve"> PAGEREF _Toc232696752 \h </w:instrText>
             </w:r>
             <w:r>
               <w:rPr>
@@ -2343,7 +2343,7 @@
               <w14:ligatures w14:val="standardContextual"/>
             </w:rPr>
           </w:pPr>
-          <w:hyperlink w:anchor="_Toc230857786" w:history="1">
+          <w:hyperlink w:anchor="_Toc232696753" w:history="1">
             <w:r>
               <w:rPr>
                 <w:rStyle w:val="Hyperlink"/>
@@ -2370,7 +2370,7 @@
                 <w:noProof/>
                 <w:webHidden/>
               </w:rPr>
-              <w:instrText xml:space="preserve"> PAGEREF _Toc230857786 \h </w:instrText>
+              <w:instrText xml:space="preserve"> PAGEREF _Toc232696753 \h </w:instrText>
             </w:r>
             <w:r>
               <w:rPr>
@@ -2414,7 +2414,7 @@
               <w14:ligatures w14:val="standardContextual"/>
             </w:rPr>
           </w:pPr>
-          <w:hyperlink w:anchor="_Toc230857787" w:history="1">
+          <w:hyperlink w:anchor="_Toc232696754" w:history="1">
             <w:r>
               <w:rPr>
                 <w:rStyle w:val="Hyperlink"/>
@@ -2441,7 +2441,7 @@
                 <w:noProof/>
                 <w:webHidden/>
               </w:rPr>
-              <w:instrText xml:space="preserve"> PAGEREF _Toc230857787 \h </w:instrText>
+              <w:instrText xml:space="preserve"> PAGEREF _Toc232696754 \h </w:instrText>
             </w:r>
             <w:r>
               <w:rPr>
@@ -2485,7 +2485,7 @@
               <w14:ligatures w14:val="standardContextual"/>
             </w:rPr>
           </w:pPr>
-          <w:hyperlink w:anchor="_Toc230857788" w:history="1">
+          <w:hyperlink w:anchor="_Toc232696755" w:history="1">
             <w:r>
               <w:rPr>
                 <w:rStyle w:val="Hyperlink"/>
@@ -2512,7 +2512,7 @@
                 <w:noProof/>
                 <w:webHidden/>
               </w:rPr>
-              <w:instrText xml:space="preserve"> PAGEREF _Toc230857788 \h </w:instrText>
+              <w:instrText xml:space="preserve"> PAGEREF _Toc232696755 \h </w:instrText>
             </w:r>
             <w:r>
               <w:rPr>
@@ -2556,7 +2556,7 @@
               <w14:ligatures w14:val="standardContextual"/>
             </w:rPr>
           </w:pPr>
-          <w:hyperlink w:anchor="_Toc230857789" w:history="1">
+          <w:hyperlink w:anchor="_Toc232696756" w:history="1">
             <w:r>
               <w:rPr>
                 <w:rStyle w:val="Hyperlink"/>
@@ -2583,7 +2583,7 @@
                 <w:noProof/>
                 <w:webHidden/>
               </w:rPr>
-              <w:instrText xml:space="preserve"> PAGEREF _Toc230857789 \h </w:instrText>
+              <w:instrText xml:space="preserve"> PAGEREF _Toc232696756 \h </w:instrText>
             </w:r>
             <w:r>
               <w:rPr>
@@ -2627,7 +2627,7 @@
               <w14:ligatures w14:val="standardContextual"/>
             </w:rPr>
           </w:pPr>
-          <w:hyperlink w:anchor="_Toc230857790" w:history="1">
+          <w:hyperlink w:anchor="_Toc232696757" w:history="1">
             <w:r>
               <w:rPr>
                 <w:rStyle w:val="Hyperlink"/>
@@ -2654,7 +2654,7 @@
                 <w:noProof/>
                 <w:webHidden/>
               </w:rPr>
-              <w:instrText xml:space="preserve"> PAGEREF _Toc230857790 \h </w:instrText>
+              <w:instrText xml:space="preserve"> PAGEREF _Toc232696757 \h </w:instrText>
             </w:r>
             <w:r>
               <w:rPr>
@@ -2698,7 +2698,7 @@
               <w14:ligatures w14:val="standardContextual"/>
             </w:rPr>
           </w:pPr>
-          <w:hyperlink w:anchor="_Toc230857791" w:history="1">
+          <w:hyperlink w:anchor="_Toc232696758" w:history="1">
             <w:r>
               <w:rPr>
                 <w:rStyle w:val="Hyperlink"/>
@@ -2725,7 +2725,7 @@
                 <w:noProof/>
                 <w:webHidden/>
               </w:rPr>
-              <w:instrText xml:space="preserve"> PAGEREF _Toc230857791 \h </w:instrText>
+              <w:instrText xml:space="preserve"> PAGEREF _Toc232696758 \h </w:instrText>
             </w:r>
             <w:r>
               <w:rPr>
@@ -2769,7 +2769,7 @@
               <w14:ligatures w14:val="standardContextual"/>
             </w:rPr>
           </w:pPr>
-          <w:hyperlink w:anchor="_Toc230857792" w:history="1">
+          <w:hyperlink w:anchor="_Toc232696759" w:history="1">
             <w:r>
               <w:rPr>
                 <w:rStyle w:val="Hyperlink"/>
@@ -2796,7 +2796,7 @@
                 <w:noProof/>
                 <w:webHidden/>
               </w:rPr>
-              <w:instrText xml:space="preserve"> PAGEREF _Toc230857792 \h </w:instrText>
+              <w:instrText xml:space="preserve"> PAGEREF _Toc232696759 \h </w:instrText>
             </w:r>
             <w:r>
               <w:rPr>
@@ -2840,7 +2840,7 @@
               <w14:ligatures w14:val="standardContextual"/>
             </w:rPr>
           </w:pPr>
-          <w:hyperlink w:anchor="_Toc230857793" w:history="1">
+          <w:hyperlink w:anchor="_Toc232696760" w:history="1">
             <w:r>
               <w:rPr>
                 <w:rStyle w:val="Hyperlink"/>
@@ -2867,7 +2867,7 @@
                 <w:noProof/>
                 <w:webHidden/>
               </w:rPr>
-              <w:instrText xml:space="preserve"> PAGEREF _Toc230857793 \h </w:instrText>
+              <w:instrText xml:space="preserve"> PAGEREF _Toc232696760 \h </w:instrText>
             </w:r>
             <w:r>
               <w:rPr>
@@ -2911,7 +2911,7 @@
               <w14:ligatures w14:val="standardContextual"/>
             </w:rPr>
           </w:pPr>
-          <w:hyperlink w:anchor="_Toc230857794" w:history="1">
+          <w:hyperlink w:anchor="_Toc232696761" w:history="1">
             <w:r>
               <w:rPr>
                 <w:rStyle w:val="Hyperlink"/>
@@ -2938,7 +2938,7 @@
                 <w:noProof/>
                 <w:webHidden/>
               </w:rPr>
-              <w:instrText xml:space="preserve"> PAGEREF _Toc230857794 \h </w:instrText>
+              <w:instrText xml:space="preserve"> PAGEREF _Toc232696761 \h </w:instrText>
             </w:r>
             <w:r>
               <w:rPr>
@@ -2982,7 +2982,7 @@
               <w14:ligatures w14:val="standardContextual"/>
             </w:rPr>
           </w:pPr>
-          <w:hyperlink w:anchor="_Toc230857795" w:history="1">
+          <w:hyperlink w:anchor="_Toc232696762" w:history="1">
             <w:r>
               <w:rPr>
                 <w:rStyle w:val="Hyperlink"/>
@@ -3009,7 +3009,7 @@
                 <w:noProof/>
                 <w:webHidden/>
               </w:rPr>
-              <w:instrText xml:space="preserve"> PAGEREF _Toc230857795 \h </w:instrText>
+              <w:instrText xml:space="preserve"> PAGEREF _Toc232696762 \h </w:instrText>
             </w:r>
             <w:r>
               <w:rPr>
@@ -3052,7 +3052,7 @@
         <w:pStyle w:val="Heading1"/>
       </w:pPr>
       <w:bookmarkStart w:id="0" w:name="data-preparation"/>
-      <w:bookmarkStart w:id="1" w:name="_Toc230857754"/>
+      <w:bookmarkStart w:id="1" w:name="_Toc232696721"/>
       <w:r>
         <w:t>DATA PREPARATION</w:t>
       </w:r>
@@ -3063,7 +3063,7 @@
         <w:pStyle w:val="Heading2"/>
       </w:pPr>
       <w:bookmarkStart w:id="2" w:name="load-libraries"/>
-      <w:bookmarkStart w:id="3" w:name="_Toc230857755"/>
+      <w:bookmarkStart w:id="3" w:name="_Toc232696722"/>
       <w:r>
         <w:t>Load libraries</w:t>
       </w:r>
@@ -3287,7 +3287,7 @@
         <w:pStyle w:val="Heading2"/>
       </w:pPr>
       <w:bookmarkStart w:id="4" w:name="load-data"/>
-      <w:bookmarkStart w:id="5" w:name="_Toc230857756"/>
+      <w:bookmarkStart w:id="5" w:name="_Toc232696723"/>
       <w:bookmarkEnd w:id="2"/>
       <w:r>
         <w:t>Load data</w:t>
@@ -3382,7 +3382,7 @@
         <w:pStyle w:val="Heading2"/>
       </w:pPr>
       <w:bookmarkStart w:id="6" w:name="Xb3ae3151d51e4d2a48e79fd6b8e852dc5c80627"/>
-      <w:bookmarkStart w:id="7" w:name="_Toc230857757"/>
+      <w:bookmarkStart w:id="7" w:name="_Toc232696724"/>
       <w:bookmarkEnd w:id="4"/>
       <w:r>
         <w:t>Subset for studies encompassing polar latitudinal region</w:t>
@@ -3465,7 +3465,7 @@
         <w:pStyle w:val="Heading3"/>
       </w:pPr>
       <w:bookmarkStart w:id="8" w:name="cleaning"/>
-      <w:bookmarkStart w:id="9" w:name="_Toc230857758"/>
+      <w:bookmarkStart w:id="9" w:name="_Toc232696725"/>
       <w:r>
         <w:t>Cleaning</w:t>
       </w:r>
@@ -3603,7 +3603,7 @@
         <w:pStyle w:val="Heading2"/>
       </w:pPr>
       <w:bookmarkStart w:id="10" w:name="missing-nd-notapp-values"/>
-      <w:bookmarkStart w:id="11" w:name="_Toc230857759"/>
+      <w:bookmarkStart w:id="11" w:name="_Toc232696726"/>
       <w:bookmarkEnd w:id="6"/>
       <w:bookmarkEnd w:id="8"/>
       <w:r>
@@ -4679,21 +4679,7 @@
         <w:rPr>
           <w:rStyle w:val="StringTok"/>
         </w:rPr>
-        <w:t>"</w:t>
-      </w:r>
-      <w:proofErr w:type="spellStart"/>
-      <w:r>
-        <w:rPr>
-          <w:rStyle w:val="StringTok"/>
-        </w:rPr>
-        <w:t>nd</w:t>
-      </w:r>
-      <w:proofErr w:type="spellEnd"/>
-      <w:r>
-        <w:rPr>
-          <w:rStyle w:val="StringTok"/>
-        </w:rPr>
-        <w:t>"</w:t>
+        <w:t>"nd"</w:t>
       </w:r>
       <w:r>
         <w:rPr>
@@ -4963,7 +4949,7 @@
         <w:pStyle w:val="Heading1"/>
       </w:pPr>
       <w:bookmarkStart w:id="12" w:name="geographical-distribution"/>
-      <w:bookmarkStart w:id="13" w:name="_Toc230857760"/>
+      <w:bookmarkStart w:id="13" w:name="_Toc232696727"/>
       <w:bookmarkEnd w:id="0"/>
       <w:bookmarkEnd w:id="10"/>
       <w:r>
@@ -5178,7 +5164,7 @@
         <w:pStyle w:val="Heading2"/>
       </w:pPr>
       <w:bookmarkStart w:id="14" w:name="provinces"/>
-      <w:bookmarkStart w:id="15" w:name="_Toc230857761"/>
+      <w:bookmarkStart w:id="15" w:name="_Toc232696728"/>
       <w:r>
         <w:t>Provinces</w:t>
       </w:r>
@@ -5214,6 +5200,15 @@
       </w:r>
       <w:r>
         <w:rPr>
+          <w:rStyle w:val="CommentTok"/>
+        </w:rPr>
+        <w:t># extract all unique province levels</w:t>
+      </w:r>
+      <w:r>
+        <w:br/>
+      </w:r>
+      <w:r>
+        <w:rPr>
           <w:rStyle w:val="NormalTok"/>
         </w:rPr>
         <w:t xml:space="preserve">prov_lvls </w:t>
@@ -5231,6 +5226,204 @@
         <w:t xml:space="preserve"> </w:t>
       </w:r>
       <w:r>
+        <w:rPr>
+          <w:rStyle w:val="FunctionTok"/>
+        </w:rPr>
+        <w:t>unique</w:t>
+      </w:r>
+      <w:r>
+        <w:rPr>
+          <w:rStyle w:val="NormalTok"/>
+        </w:rPr>
+        <w:t>(</w:t>
+      </w:r>
+      <w:r>
+        <w:rPr>
+          <w:rStyle w:val="FunctionTok"/>
+        </w:rPr>
+        <w:t>unlist</w:t>
+      </w:r>
+      <w:r>
+        <w:rPr>
+          <w:rStyle w:val="NormalTok"/>
+        </w:rPr>
+        <w:t>(</w:t>
+      </w:r>
+      <w:r>
+        <w:rPr>
+          <w:rStyle w:val="FunctionTok"/>
+        </w:rPr>
+        <w:t>str_split</w:t>
+      </w:r>
+      <w:r>
+        <w:rPr>
+          <w:rStyle w:val="NormalTok"/>
+        </w:rPr>
+        <w:t>(location</w:t>
+      </w:r>
+      <w:r>
+        <w:rPr>
+          <w:rStyle w:val="SpecialCharTok"/>
+        </w:rPr>
+        <w:t>$</w:t>
+      </w:r>
+      <w:r>
+        <w:rPr>
+          <w:rStyle w:val="NormalTok"/>
+        </w:rPr>
+        <w:t xml:space="preserve">prov_code, </w:t>
+      </w:r>
+      <w:r>
+        <w:rPr>
+          <w:rStyle w:val="StringTok"/>
+        </w:rPr>
+        <w:t>"_"</w:t>
+      </w:r>
+      <w:r>
+        <w:rPr>
+          <w:rStyle w:val="NormalTok"/>
+        </w:rPr>
+        <w:t>)))</w:t>
+      </w:r>
+      <w:r>
+        <w:br/>
+      </w:r>
+      <w:r>
+        <w:br/>
+      </w:r>
+      <w:r>
+        <w:rPr>
+          <w:rStyle w:val="CommentTok"/>
+        </w:rPr>
+        <w:t># create columns with exact matching</w:t>
+      </w:r>
+      <w:r>
+        <w:br/>
+      </w:r>
+      <w:r>
+        <w:rPr>
+          <w:rStyle w:val="NormalTok"/>
+        </w:rPr>
+        <w:t xml:space="preserve">prov[, prov_lvls] </w:t>
+      </w:r>
+      <w:r>
+        <w:rPr>
+          <w:rStyle w:val="OtherTok"/>
+        </w:rPr>
+        <w:t>&lt;-</w:t>
+      </w:r>
+      <w:r>
+        <w:rPr>
+          <w:rStyle w:val="NormalTok"/>
+        </w:rPr>
+        <w:t xml:space="preserve"> </w:t>
+      </w:r>
+      <w:r>
+        <w:rPr>
+          <w:rStyle w:val="FunctionTok"/>
+        </w:rPr>
+        <w:t>t</w:t>
+      </w:r>
+      <w:r>
+        <w:rPr>
+          <w:rStyle w:val="NormalTok"/>
+        </w:rPr>
+        <w:t>(</w:t>
+      </w:r>
+      <w:r>
+        <w:rPr>
+          <w:rStyle w:val="FunctionTok"/>
+        </w:rPr>
+        <w:t>sapply</w:t>
+      </w:r>
+      <w:r>
+        <w:rPr>
+          <w:rStyle w:val="NormalTok"/>
+        </w:rPr>
+        <w:t>(location</w:t>
+      </w:r>
+      <w:r>
+        <w:rPr>
+          <w:rStyle w:val="SpecialCharTok"/>
+        </w:rPr>
+        <w:t>$</w:t>
+      </w:r>
+      <w:r>
+        <w:rPr>
+          <w:rStyle w:val="NormalTok"/>
+        </w:rPr>
+        <w:t xml:space="preserve">prov_code, </w:t>
+      </w:r>
+      <w:r>
+        <w:rPr>
+          <w:rStyle w:val="ControlFlowTok"/>
+        </w:rPr>
+        <w:t>function</w:t>
+      </w:r>
+      <w:r>
+        <w:rPr>
+          <w:rStyle w:val="NormalTok"/>
+        </w:rPr>
+        <w:t>(x) {</w:t>
+      </w:r>
+      <w:r>
+        <w:br/>
+      </w:r>
+      <w:r>
+        <w:rPr>
+          <w:rStyle w:val="NormalTok"/>
+        </w:rPr>
+        <w:t xml:space="preserve">  parts </w:t>
+      </w:r>
+      <w:r>
+        <w:rPr>
+          <w:rStyle w:val="OtherTok"/>
+        </w:rPr>
+        <w:t>&lt;-</w:t>
+      </w:r>
+      <w:r>
+        <w:rPr>
+          <w:rStyle w:val="NormalTok"/>
+        </w:rPr>
+        <w:t xml:space="preserve"> </w:t>
+      </w:r>
+      <w:r>
+        <w:rPr>
+          <w:rStyle w:val="FunctionTok"/>
+        </w:rPr>
+        <w:t>str_split</w:t>
+      </w:r>
+      <w:r>
+        <w:rPr>
+          <w:rStyle w:val="NormalTok"/>
+        </w:rPr>
+        <w:t xml:space="preserve">(x, </w:t>
+      </w:r>
+      <w:r>
+        <w:rPr>
+          <w:rStyle w:val="StringTok"/>
+        </w:rPr>
+        <w:t>"_"</w:t>
+      </w:r>
+      <w:r>
+        <w:rPr>
+          <w:rStyle w:val="NormalTok"/>
+        </w:rPr>
+        <w:t>)[[</w:t>
+      </w:r>
+      <w:r>
+        <w:rPr>
+          <w:rStyle w:val="DecValTok"/>
+        </w:rPr>
+        <w:t>1</w:t>
+      </w:r>
+      <w:r>
+        <w:rPr>
+          <w:rStyle w:val="NormalTok"/>
+        </w:rPr>
+        <w:t>]]</w:t>
+      </w:r>
+      <w:r>
         <w:br/>
       </w:r>
       <w:r>
@@ -5243,220 +5436,37 @@
         <w:rPr>
           <w:rStyle w:val="FunctionTok"/>
         </w:rPr>
-        <w:t>unique</w:t>
-      </w:r>
-      <w:r>
-        <w:rPr>
-          <w:rStyle w:val="NormalTok"/>
-        </w:rPr>
-        <w:t>(</w:t>
-      </w:r>
-      <w:r>
-        <w:br/>
-      </w:r>
-      <w:r>
-        <w:rPr>
-          <w:rStyle w:val="NormalTok"/>
-        </w:rPr>
-        <w:t xml:space="preserve">    </w:t>
-      </w:r>
-      <w:r>
-        <w:rPr>
-          <w:rStyle w:val="FunctionTok"/>
-        </w:rPr>
-        <w:t>unlist</w:t>
-      </w:r>
-      <w:r>
-        <w:rPr>
-          <w:rStyle w:val="NormalTok"/>
-        </w:rPr>
-        <w:t>(</w:t>
-      </w:r>
-      <w:r>
-        <w:br/>
-      </w:r>
-      <w:r>
-        <w:rPr>
-          <w:rStyle w:val="NormalTok"/>
-        </w:rPr>
-        <w:t xml:space="preserve">      </w:t>
-      </w:r>
-      <w:r>
-        <w:rPr>
-          <w:rStyle w:val="FunctionTok"/>
-        </w:rPr>
-        <w:t>str_split</w:t>
-      </w:r>
-      <w:r>
-        <w:rPr>
-          <w:rStyle w:val="NormalTok"/>
-        </w:rPr>
-        <w:t>(location</w:t>
-      </w:r>
-      <w:r>
-        <w:rPr>
-          <w:rStyle w:val="SpecialCharTok"/>
-        </w:rPr>
-        <w:t>$</w:t>
-      </w:r>
-      <w:r>
-        <w:rPr>
-          <w:rStyle w:val="NormalTok"/>
-        </w:rPr>
-        <w:t xml:space="preserve">prov_code, </w:t>
-      </w:r>
-      <w:r>
-        <w:rPr>
-          <w:rStyle w:val="StringTok"/>
-        </w:rPr>
-        <w:t>"</w:t>
-      </w:r>
-      <w:r>
-        <w:rPr>
-          <w:rStyle w:val="SpecialCharTok"/>
-        </w:rPr>
-        <w:t>\\</w:t>
-      </w:r>
-      <w:r>
-        <w:rPr>
-          <w:rStyle w:val="StringTok"/>
-        </w:rPr>
-        <w:t>_"</w:t>
-      </w:r>
-      <w:r>
-        <w:rPr>
-          <w:rStyle w:val="NormalTok"/>
-        </w:rPr>
-        <w:t>)</w:t>
-      </w:r>
-      <w:r>
-        <w:br/>
-      </w:r>
-      <w:r>
-        <w:rPr>
-          <w:rStyle w:val="NormalTok"/>
-        </w:rPr>
-        <w:t xml:space="preserve">                               )</w:t>
-      </w:r>
-      <w:r>
-        <w:br/>
-      </w:r>
-      <w:r>
-        <w:rPr>
-          <w:rStyle w:val="NormalTok"/>
-        </w:rPr>
-        <w:t xml:space="preserve">                        )</w:t>
-      </w:r>
-      <w:r>
-        <w:br/>
-      </w:r>
-      <w:r>
-        <w:br/>
-      </w:r>
-      <w:r>
-        <w:br/>
-      </w:r>
-      <w:r>
-        <w:rPr>
-          <w:rStyle w:val="NormalTok"/>
-        </w:rPr>
-        <w:t xml:space="preserve">prov[,prov_lvls] </w:t>
-      </w:r>
-      <w:r>
-        <w:rPr>
-          <w:rStyle w:val="OtherTok"/>
-        </w:rPr>
-        <w:t>&lt;-</w:t>
-      </w:r>
-      <w:r>
-        <w:rPr>
-          <w:rStyle w:val="NormalTok"/>
-        </w:rPr>
-        <w:t xml:space="preserve"> </w:t>
-      </w:r>
-      <w:r>
-        <w:rPr>
-          <w:rStyle w:val="FunctionTok"/>
-        </w:rPr>
-        <w:t>sapply</w:t>
-      </w:r>
-      <w:r>
-        <w:rPr>
-          <w:rStyle w:val="NormalTok"/>
-        </w:rPr>
-        <w:t xml:space="preserve">(prov_lvls, </w:t>
-      </w:r>
-      <w:r>
-        <w:br/>
-      </w:r>
-      <w:r>
-        <w:rPr>
-          <w:rStyle w:val="NormalTok"/>
-        </w:rPr>
-        <w:t xml:space="preserve">                                      </w:t>
-      </w:r>
-      <w:r>
-        <w:rPr>
-          <w:rStyle w:val="ControlFlowTok"/>
-        </w:rPr>
-        <w:t>function</w:t>
-      </w:r>
-      <w:r>
-        <w:rPr>
-          <w:rStyle w:val="NormalTok"/>
-        </w:rPr>
-        <w:t>(y){</w:t>
-      </w:r>
-      <w:r>
-        <w:br/>
-      </w:r>
-      <w:r>
-        <w:rPr>
-          <w:rStyle w:val="NormalTok"/>
-        </w:rPr>
-        <w:t xml:space="preserve">                                        </w:t>
-      </w:r>
-      <w:r>
-        <w:rPr>
-          <w:rStyle w:val="FunctionTok"/>
-        </w:rPr>
-        <w:t>str_count</w:t>
-      </w:r>
-      <w:r>
-        <w:rPr>
-          <w:rStyle w:val="NormalTok"/>
-        </w:rPr>
-        <w:t>(location</w:t>
-      </w:r>
-      <w:r>
-        <w:rPr>
-          <w:rStyle w:val="SpecialCharTok"/>
-        </w:rPr>
-        <w:t>$</w:t>
-      </w:r>
-      <w:r>
-        <w:rPr>
-          <w:rStyle w:val="NormalTok"/>
-        </w:rPr>
-        <w:t>prov_code, y)</w:t>
-      </w:r>
-      <w:r>
-        <w:br/>
-      </w:r>
-      <w:r>
-        <w:rPr>
-          <w:rStyle w:val="NormalTok"/>
-        </w:rPr>
-        <w:t xml:space="preserve">                                        }</w:t>
-      </w:r>
-      <w:r>
-        <w:br/>
-      </w:r>
-      <w:r>
-        <w:rPr>
-          <w:rStyle w:val="NormalTok"/>
-        </w:rPr>
-        <w:t xml:space="preserve">                                      )</w:t>
+        <w:t>as.integer</w:t>
+      </w:r>
+      <w:r>
+        <w:rPr>
+          <w:rStyle w:val="NormalTok"/>
+        </w:rPr>
+        <w:t xml:space="preserve">(prov_lvls </w:t>
+      </w:r>
+      <w:r>
+        <w:rPr>
+          <w:rStyle w:val="SpecialCharTok"/>
+        </w:rPr>
+        <w:t>%in%</w:t>
+      </w:r>
+      <w:r>
+        <w:rPr>
+          <w:rStyle w:val="NormalTok"/>
+        </w:rPr>
+        <w:t xml:space="preserve"> parts)</w:t>
+      </w:r>
+      <w:r>
+        <w:br/>
+      </w:r>
+      <w:r>
+        <w:rPr>
+          <w:rStyle w:val="NormalTok"/>
+        </w:rPr>
+        <w:t>}))</w:t>
+      </w:r>
+      <w:r>
+        <w:br/>
       </w:r>
       <w:r>
         <w:br/>
@@ -5920,7 +5930,7 @@
         <w:rPr>
           <w:rStyle w:val="VerbatimChar"/>
         </w:rPr>
-        <w:t>## # A tibble: 3 × 3</w:t>
+        <w:t>## # A tibble: 2 × 3</w:t>
       </w:r>
       <w:r>
         <w:br/>
@@ -5947,7 +5957,7 @@
         <w:rPr>
           <w:rStyle w:val="VerbatimChar"/>
         </w:rPr>
-        <w:t>## 1 1                      21         70</w:t>
+        <w:t>## 1 1                      29         97</w:t>
       </w:r>
       <w:r>
         <w:br/>
@@ -5956,16 +5966,7 @@
         <w:rPr>
           <w:rStyle w:val="VerbatimChar"/>
         </w:rPr>
-        <w:t>## 2 2                       8         27</w:t>
-      </w:r>
-      <w:r>
-        <w:br/>
-      </w:r>
-      <w:r>
-        <w:rPr>
-          <w:rStyle w:val="VerbatimChar"/>
-        </w:rPr>
-        <w:t>## 3 3                       1          3</w:t>
+        <w:t>## 2 2                       1          3</w:t>
       </w:r>
     </w:p>
     <w:p>
@@ -5984,163 +5985,163 @@
         <w:rPr>
           <w:rStyle w:val="NormalTok"/>
         </w:rPr>
+        <w:t xml:space="preserve">prov_tot </w:t>
+      </w:r>
+      <w:r>
+        <w:rPr>
+          <w:rStyle w:val="OtherTok"/>
+        </w:rPr>
+        <w:t>&lt;-</w:t>
+      </w:r>
+      <w:r>
+        <w:rPr>
+          <w:rStyle w:val="NormalTok"/>
+        </w:rPr>
+        <w:t xml:space="preserve"> </w:t>
+      </w:r>
+      <w:r>
+        <w:br/>
+      </w:r>
+      <w:r>
+        <w:rPr>
+          <w:rStyle w:val="NormalTok"/>
+        </w:rPr>
+        <w:t xml:space="preserve">  prov [, </w:t>
+      </w:r>
+      <w:r>
+        <w:rPr>
+          <w:rStyle w:val="SpecialCharTok"/>
+        </w:rPr>
+        <w:t>-</w:t>
+      </w:r>
+      <w:r>
+        <w:rPr>
+          <w:rStyle w:val="NormalTok"/>
+        </w:rPr>
+        <w:t>(</w:t>
+      </w:r>
+      <w:r>
+        <w:rPr>
+          <w:rStyle w:val="FunctionTok"/>
+        </w:rPr>
+        <w:t>length</w:t>
+      </w:r>
+      <w:r>
+        <w:rPr>
+          <w:rStyle w:val="NormalTok"/>
+        </w:rPr>
+        <w:t>(prov)</w:t>
+      </w:r>
+      <w:r>
+        <w:rPr>
+          <w:rStyle w:val="SpecialCharTok"/>
+        </w:rPr>
+        <w:t>-</w:t>
+      </w:r>
+      <w:r>
+        <w:rPr>
+          <w:rStyle w:val="DecValTok"/>
+        </w:rPr>
+        <w:t>1</w:t>
+      </w:r>
+      <w:r>
+        <w:rPr>
+          <w:rStyle w:val="NormalTok"/>
+        </w:rPr>
+        <w:t xml:space="preserve">)] </w:t>
+      </w:r>
+      <w:r>
+        <w:rPr>
+          <w:rStyle w:val="SpecialCharTok"/>
+        </w:rPr>
+        <w:t>%&gt;%</w:t>
+      </w:r>
+      <w:r>
+        <w:rPr>
+          <w:rStyle w:val="NormalTok"/>
+        </w:rPr>
+        <w:t xml:space="preserve"> </w:t>
+      </w:r>
+      <w:r>
+        <w:rPr>
+          <w:rStyle w:val="CommentTok"/>
+        </w:rPr>
+        <w:t># filter out the sum column</w:t>
+      </w:r>
+      <w:r>
+        <w:br/>
+      </w:r>
+      <w:r>
+        <w:rPr>
+          <w:rStyle w:val="NormalTok"/>
+        </w:rPr>
+        <w:t xml:space="preserve">  </w:t>
+      </w:r>
+      <w:r>
+        <w:rPr>
+          <w:rStyle w:val="FunctionTok"/>
+        </w:rPr>
+        <w:t>summarise</w:t>
+      </w:r>
+      <w:r>
+        <w:rPr>
+          <w:rStyle w:val="NormalTok"/>
+        </w:rPr>
+        <w:t>(</w:t>
+      </w:r>
+      <w:r>
+        <w:rPr>
+          <w:rStyle w:val="FunctionTok"/>
+        </w:rPr>
+        <w:t>across</w:t>
+      </w:r>
+      <w:r>
+        <w:rPr>
+          <w:rStyle w:val="NormalTok"/>
+        </w:rPr>
+        <w:t>(</w:t>
+      </w:r>
+      <w:r>
+        <w:rPr>
+          <w:rStyle w:val="FunctionTok"/>
+        </w:rPr>
+        <w:t>where</w:t>
+      </w:r>
+      <w:r>
+        <w:rPr>
+          <w:rStyle w:val="NormalTok"/>
+        </w:rPr>
+        <w:t xml:space="preserve">(is.numeric), </w:t>
+      </w:r>
+      <w:r>
+        <w:br/>
+      </w:r>
+      <w:r>
+        <w:rPr>
+          <w:rStyle w:val="NormalTok"/>
+        </w:rPr>
+        <w:t xml:space="preserve">                   </w:t>
+      </w:r>
+      <w:r>
+        <w:rPr>
+          <w:rStyle w:val="FunctionTok"/>
+        </w:rPr>
+        <w:t>list</w:t>
+      </w:r>
+      <w:r>
+        <w:rPr>
+          <w:rStyle w:val="NormalTok"/>
+        </w:rPr>
+        <w:t>(sum)</w:t>
+      </w:r>
+      <w:r>
+        <w:br/>
+      </w:r>
+      <w:r>
+        <w:rPr>
+          <w:rStyle w:val="NormalTok"/>
+        </w:rPr>
         <w:lastRenderedPageBreak/>
-        <w:t xml:space="preserve">prov_tot </w:t>
-      </w:r>
-      <w:r>
-        <w:rPr>
-          <w:rStyle w:val="OtherTok"/>
-        </w:rPr>
-        <w:t>&lt;-</w:t>
-      </w:r>
-      <w:r>
-        <w:rPr>
-          <w:rStyle w:val="NormalTok"/>
-        </w:rPr>
-        <w:t xml:space="preserve"> </w:t>
-      </w:r>
-      <w:r>
-        <w:br/>
-      </w:r>
-      <w:r>
-        <w:rPr>
-          <w:rStyle w:val="NormalTok"/>
-        </w:rPr>
-        <w:t xml:space="preserve">  prov [, </w:t>
-      </w:r>
-      <w:r>
-        <w:rPr>
-          <w:rStyle w:val="SpecialCharTok"/>
-        </w:rPr>
-        <w:t>-</w:t>
-      </w:r>
-      <w:r>
-        <w:rPr>
-          <w:rStyle w:val="NormalTok"/>
-        </w:rPr>
-        <w:t>(</w:t>
-      </w:r>
-      <w:r>
-        <w:rPr>
-          <w:rStyle w:val="FunctionTok"/>
-        </w:rPr>
-        <w:t>length</w:t>
-      </w:r>
-      <w:r>
-        <w:rPr>
-          <w:rStyle w:val="NormalTok"/>
-        </w:rPr>
-        <w:t>(prov)</w:t>
-      </w:r>
-      <w:r>
-        <w:rPr>
-          <w:rStyle w:val="SpecialCharTok"/>
-        </w:rPr>
-        <w:t>-</w:t>
-      </w:r>
-      <w:r>
-        <w:rPr>
-          <w:rStyle w:val="DecValTok"/>
-        </w:rPr>
-        <w:t>1</w:t>
-      </w:r>
-      <w:r>
-        <w:rPr>
-          <w:rStyle w:val="NormalTok"/>
-        </w:rPr>
-        <w:t xml:space="preserve">)] </w:t>
-      </w:r>
-      <w:r>
-        <w:rPr>
-          <w:rStyle w:val="SpecialCharTok"/>
-        </w:rPr>
-        <w:t>%&gt;%</w:t>
-      </w:r>
-      <w:r>
-        <w:rPr>
-          <w:rStyle w:val="NormalTok"/>
-        </w:rPr>
-        <w:t xml:space="preserve"> </w:t>
-      </w:r>
-      <w:r>
-        <w:rPr>
-          <w:rStyle w:val="CommentTok"/>
-        </w:rPr>
-        <w:t># filter out the sum column</w:t>
-      </w:r>
-      <w:r>
-        <w:br/>
-      </w:r>
-      <w:r>
-        <w:rPr>
-          <w:rStyle w:val="NormalTok"/>
-        </w:rPr>
-        <w:t xml:space="preserve">  </w:t>
-      </w:r>
-      <w:r>
-        <w:rPr>
-          <w:rStyle w:val="FunctionTok"/>
-        </w:rPr>
-        <w:t>summarise</w:t>
-      </w:r>
-      <w:r>
-        <w:rPr>
-          <w:rStyle w:val="NormalTok"/>
-        </w:rPr>
-        <w:t>(</w:t>
-      </w:r>
-      <w:r>
-        <w:rPr>
-          <w:rStyle w:val="FunctionTok"/>
-        </w:rPr>
-        <w:t>across</w:t>
-      </w:r>
-      <w:r>
-        <w:rPr>
-          <w:rStyle w:val="NormalTok"/>
-        </w:rPr>
-        <w:t>(</w:t>
-      </w:r>
-      <w:r>
-        <w:rPr>
-          <w:rStyle w:val="FunctionTok"/>
-        </w:rPr>
-        <w:t>where</w:t>
-      </w:r>
-      <w:r>
-        <w:rPr>
-          <w:rStyle w:val="NormalTok"/>
-        </w:rPr>
-        <w:t xml:space="preserve">(is.numeric), </w:t>
-      </w:r>
-      <w:r>
-        <w:br/>
-      </w:r>
-      <w:r>
-        <w:rPr>
-          <w:rStyle w:val="NormalTok"/>
-        </w:rPr>
-        <w:t xml:space="preserve">                   </w:t>
-      </w:r>
-      <w:r>
-        <w:rPr>
-          <w:rStyle w:val="FunctionTok"/>
-        </w:rPr>
-        <w:t>list</w:t>
-      </w:r>
-      <w:r>
-        <w:rPr>
-          <w:rStyle w:val="NormalTok"/>
-        </w:rPr>
-        <w:t>(sum)</w:t>
-      </w:r>
-      <w:r>
-        <w:br/>
-      </w:r>
-      <w:r>
-        <w:rPr>
-          <w:rStyle w:val="NormalTok"/>
-        </w:rPr>
         <w:t xml:space="preserve">                   )</w:t>
       </w:r>
       <w:r>
@@ -6386,7 +6387,7 @@
         <w:pStyle w:val="Heading2"/>
       </w:pPr>
       <w:bookmarkStart w:id="16" w:name="ecoregions"/>
-      <w:bookmarkStart w:id="17" w:name="_Toc230857762"/>
+      <w:bookmarkStart w:id="17" w:name="_Toc232696729"/>
       <w:bookmarkEnd w:id="14"/>
       <w:r>
         <w:t>Ecoregions</w:t>
@@ -7018,7 +7019,6 @@
         <w:rPr>
           <w:rStyle w:val="NormalTok"/>
         </w:rPr>
-        <w:lastRenderedPageBreak/>
         <w:t xml:space="preserve">  </w:t>
       </w:r>
       <w:r>
@@ -7189,6 +7189,7 @@
         <w:rPr>
           <w:rStyle w:val="VerbatimChar"/>
         </w:rPr>
+        <w:lastRenderedPageBreak/>
         <w:t>## # A tibble: 3 × 3</w:t>
       </w:r>
       <w:r>
@@ -8106,7 +8107,7 @@
         <w:pStyle w:val="Heading2"/>
       </w:pPr>
       <w:bookmarkStart w:id="18" w:name="realms"/>
-      <w:bookmarkStart w:id="19" w:name="_Toc230857763"/>
+      <w:bookmarkStart w:id="19" w:name="_Toc232696730"/>
       <w:bookmarkEnd w:id="16"/>
       <w:r>
         <w:t>Realms</w:t>
@@ -8216,43 +8217,43 @@
         <w:rPr>
           <w:rStyle w:val="VerbatimChar"/>
         </w:rPr>
+        <w:t>## `summarise()` has regrouped the output.</w:t>
+      </w:r>
+      <w:r>
+        <w:br/>
+      </w:r>
+      <w:r>
+        <w:rPr>
+          <w:rStyle w:val="VerbatimChar"/>
+        </w:rPr>
+        <w:t>## ℹ Summaries were computed grouped by RLM_CODE and REALM.</w:t>
+      </w:r>
+      <w:r>
+        <w:br/>
+      </w:r>
+      <w:r>
+        <w:rPr>
+          <w:rStyle w:val="VerbatimChar"/>
+        </w:rPr>
+        <w:t>## ℹ Output is grouped by RLM_CODE.</w:t>
+      </w:r>
+      <w:r>
+        <w:br/>
+      </w:r>
+      <w:r>
+        <w:rPr>
+          <w:rStyle w:val="VerbatimChar"/>
+        </w:rPr>
+        <w:t>## ℹ Use `summarise(.groups = "drop_last")` to silence this message.</w:t>
+      </w:r>
+      <w:r>
+        <w:br/>
+      </w:r>
+      <w:r>
+        <w:rPr>
+          <w:rStyle w:val="VerbatimChar"/>
+        </w:rPr>
         <w:lastRenderedPageBreak/>
-        <w:t>## `summarise()` has regrouped the output.</w:t>
-      </w:r>
-      <w:r>
-        <w:br/>
-      </w:r>
-      <w:r>
-        <w:rPr>
-          <w:rStyle w:val="VerbatimChar"/>
-        </w:rPr>
-        <w:t>## ℹ Summaries were computed grouped by RLM_CODE and REALM.</w:t>
-      </w:r>
-      <w:r>
-        <w:br/>
-      </w:r>
-      <w:r>
-        <w:rPr>
-          <w:rStyle w:val="VerbatimChar"/>
-        </w:rPr>
-        <w:t>## ℹ Output is grouped by RLM_CODE.</w:t>
-      </w:r>
-      <w:r>
-        <w:br/>
-      </w:r>
-      <w:r>
-        <w:rPr>
-          <w:rStyle w:val="VerbatimChar"/>
-        </w:rPr>
-        <w:t>## ℹ Use `summarise(.groups = "drop_last")` to silence this message.</w:t>
-      </w:r>
-      <w:r>
-        <w:br/>
-      </w:r>
-      <w:r>
-        <w:rPr>
-          <w:rStyle w:val="VerbatimChar"/>
-        </w:rPr>
         <w:t>## ℹ Use `summarise(.by = c(RLM_CODE, REALM))` for per-operation grouping</w:t>
       </w:r>
       <w:r>
@@ -8359,30 +8360,24 @@
       <w:pPr>
         <w:pStyle w:val="SourceCode"/>
       </w:pPr>
-      <w:proofErr w:type="spellStart"/>
-      <w:proofErr w:type="gramStart"/>
       <w:r>
         <w:rPr>
           <w:rStyle w:val="NormalTok"/>
         </w:rPr>
         <w:t>writexl</w:t>
       </w:r>
-      <w:proofErr w:type="spellEnd"/>
       <w:r>
         <w:rPr>
           <w:rStyle w:val="SpecialCharTok"/>
         </w:rPr>
         <w:t>::</w:t>
       </w:r>
-      <w:proofErr w:type="spellStart"/>
-      <w:proofErr w:type="gramEnd"/>
       <w:r>
         <w:rPr>
           <w:rStyle w:val="FunctionTok"/>
         </w:rPr>
         <w:t>write_xlsx</w:t>
       </w:r>
-      <w:proofErr w:type="spellEnd"/>
       <w:r>
         <w:rPr>
           <w:rStyle w:val="NormalTok"/>
@@ -8464,7 +8459,7 @@
         <w:pStyle w:val="Heading2"/>
       </w:pPr>
       <w:bookmarkStart w:id="20" w:name="Xcccc856798639fd953149da29372fec3e898081"/>
-      <w:bookmarkStart w:id="21" w:name="_Toc230857764"/>
+      <w:bookmarkStart w:id="21" w:name="_Toc232696731"/>
       <w:bookmarkEnd w:id="18"/>
       <w:r>
         <w:t>Export geographical distribution summary tables</w:t>
@@ -8586,7 +8581,7 @@
         <w:pStyle w:val="Heading1"/>
       </w:pPr>
       <w:bookmarkStart w:id="22" w:name="count-columns-with-combo"/>
-      <w:bookmarkStart w:id="23" w:name="_Toc230857765"/>
+      <w:bookmarkStart w:id="23" w:name="_Toc232696732"/>
       <w:bookmarkEnd w:id="12"/>
       <w:bookmarkEnd w:id="20"/>
       <w:r>
@@ -9004,154 +8999,154 @@
         <w:rPr>
           <w:rStyle w:val="NormalTok"/>
         </w:rPr>
+        <w:t xml:space="preserve">  </w:t>
+      </w:r>
+      <w:r>
+        <w:br/>
+      </w:r>
+      <w:r>
+        <w:rPr>
+          <w:rStyle w:val="NormalTok"/>
+        </w:rPr>
+        <w:t xml:space="preserve">  count_results[[col_name]] </w:t>
+      </w:r>
+      <w:r>
+        <w:rPr>
+          <w:rStyle w:val="SpecialCharTok"/>
+        </w:rPr>
+        <w:t>%&lt;&gt;%</w:t>
+      </w:r>
+      <w:r>
+        <w:br/>
+      </w:r>
+      <w:r>
+        <w:rPr>
+          <w:rStyle w:val="NormalTok"/>
+        </w:rPr>
+        <w:t xml:space="preserve">    </w:t>
+      </w:r>
+      <w:r>
+        <w:rPr>
+          <w:rStyle w:val="FunctionTok"/>
+        </w:rPr>
+        <w:t>filter</w:t>
+      </w:r>
+      <w:r>
+        <w:rPr>
+          <w:rStyle w:val="NormalTok"/>
+        </w:rPr>
+        <w:t>(</w:t>
+      </w:r>
+      <w:r>
+        <w:br/>
+      </w:r>
+      <w:r>
+        <w:rPr>
+          <w:rStyle w:val="NormalTok"/>
+        </w:rPr>
+        <w:t xml:space="preserve">      </w:t>
+      </w:r>
+      <w:r>
+        <w:rPr>
+          <w:rStyle w:val="FunctionTok"/>
+        </w:rPr>
+        <w:t>if_all</w:t>
+      </w:r>
+      <w:r>
+        <w:rPr>
+          <w:rStyle w:val="NormalTok"/>
+        </w:rPr>
+        <w:t>(</w:t>
+      </w:r>
+      <w:r>
+        <w:rPr>
+          <w:rStyle w:val="AttributeTok"/>
+        </w:rPr>
+        <w:t>.cols =</w:t>
+      </w:r>
+      <w:r>
+        <w:rPr>
+          <w:rStyle w:val="NormalTok"/>
+        </w:rPr>
+        <w:t xml:space="preserve"> </w:t>
+      </w:r>
+      <w:r>
+        <w:rPr>
+          <w:rStyle w:val="FunctionTok"/>
+        </w:rPr>
+        <w:t>everything</w:t>
+      </w:r>
+      <w:r>
+        <w:rPr>
+          <w:rStyle w:val="NormalTok"/>
+        </w:rPr>
+        <w:t xml:space="preserve">(), </w:t>
+      </w:r>
+      <w:r>
+        <w:rPr>
+          <w:rStyle w:val="SpecialCharTok"/>
+        </w:rPr>
+        <w:t>~</w:t>
+      </w:r>
+      <w:r>
+        <w:rPr>
+          <w:rStyle w:val="NormalTok"/>
+        </w:rPr>
+        <w:t xml:space="preserve"> </w:t>
+      </w:r>
+      <w:r>
+        <w:rPr>
+          <w:rStyle w:val="SpecialCharTok"/>
+        </w:rPr>
+        <w:t>!</w:t>
+      </w:r>
+      <w:r>
+        <w:rPr>
+          <w:rStyle w:val="FunctionTok"/>
+        </w:rPr>
+        <w:t>grepl</w:t>
+      </w:r>
+      <w:r>
+        <w:rPr>
+          <w:rStyle w:val="NormalTok"/>
+        </w:rPr>
+        <w:t>(</w:t>
+      </w:r>
+      <w:r>
+        <w:rPr>
+          <w:rStyle w:val="StringTok"/>
+        </w:rPr>
+        <w:t>"notapp"</w:t>
+      </w:r>
+      <w:r>
+        <w:rPr>
+          <w:rStyle w:val="NormalTok"/>
+        </w:rPr>
+        <w:t>, .x))</w:t>
+      </w:r>
+      <w:r>
+        <w:br/>
+      </w:r>
+      <w:r>
+        <w:rPr>
+          <w:rStyle w:val="NormalTok"/>
+        </w:rPr>
+        <w:t xml:space="preserve">    ) </w:t>
+      </w:r>
+      <w:r>
+        <w:rPr>
+          <w:rStyle w:val="SpecialCharTok"/>
+        </w:rPr>
+        <w:t>%&gt;%</w:t>
+      </w:r>
+      <w:r>
+        <w:br/>
+      </w:r>
+      <w:r>
+        <w:rPr>
+          <w:rStyle w:val="NormalTok"/>
+        </w:rPr>
         <w:lastRenderedPageBreak/>
-        <w:t xml:space="preserve">  </w:t>
-      </w:r>
-      <w:r>
-        <w:br/>
-      </w:r>
-      <w:r>
-        <w:rPr>
-          <w:rStyle w:val="NormalTok"/>
-        </w:rPr>
-        <w:t xml:space="preserve">  count_results[[col_name]] </w:t>
-      </w:r>
-      <w:r>
-        <w:rPr>
-          <w:rStyle w:val="SpecialCharTok"/>
-        </w:rPr>
-        <w:t>%&lt;&gt;%</w:t>
-      </w:r>
-      <w:r>
-        <w:br/>
-      </w:r>
-      <w:r>
-        <w:rPr>
-          <w:rStyle w:val="NormalTok"/>
-        </w:rPr>
-        <w:t xml:space="preserve">    </w:t>
-      </w:r>
-      <w:r>
-        <w:rPr>
-          <w:rStyle w:val="FunctionTok"/>
-        </w:rPr>
-        <w:t>filter</w:t>
-      </w:r>
-      <w:r>
-        <w:rPr>
-          <w:rStyle w:val="NormalTok"/>
-        </w:rPr>
-        <w:t>(</w:t>
-      </w:r>
-      <w:r>
-        <w:br/>
-      </w:r>
-      <w:r>
-        <w:rPr>
-          <w:rStyle w:val="NormalTok"/>
-        </w:rPr>
-        <w:t xml:space="preserve">      </w:t>
-      </w:r>
-      <w:r>
-        <w:rPr>
-          <w:rStyle w:val="FunctionTok"/>
-        </w:rPr>
-        <w:t>if_all</w:t>
-      </w:r>
-      <w:r>
-        <w:rPr>
-          <w:rStyle w:val="NormalTok"/>
-        </w:rPr>
-        <w:t>(</w:t>
-      </w:r>
-      <w:r>
-        <w:rPr>
-          <w:rStyle w:val="AttributeTok"/>
-        </w:rPr>
-        <w:t>.cols =</w:t>
-      </w:r>
-      <w:r>
-        <w:rPr>
-          <w:rStyle w:val="NormalTok"/>
-        </w:rPr>
-        <w:t xml:space="preserve"> </w:t>
-      </w:r>
-      <w:r>
-        <w:rPr>
-          <w:rStyle w:val="FunctionTok"/>
-        </w:rPr>
-        <w:t>everything</w:t>
-      </w:r>
-      <w:r>
-        <w:rPr>
-          <w:rStyle w:val="NormalTok"/>
-        </w:rPr>
-        <w:t xml:space="preserve">(), </w:t>
-      </w:r>
-      <w:r>
-        <w:rPr>
-          <w:rStyle w:val="SpecialCharTok"/>
-        </w:rPr>
-        <w:t>~</w:t>
-      </w:r>
-      <w:r>
-        <w:rPr>
-          <w:rStyle w:val="NormalTok"/>
-        </w:rPr>
-        <w:t xml:space="preserve"> </w:t>
-      </w:r>
-      <w:r>
-        <w:rPr>
-          <w:rStyle w:val="SpecialCharTok"/>
-        </w:rPr>
-        <w:t>!</w:t>
-      </w:r>
-      <w:r>
-        <w:rPr>
-          <w:rStyle w:val="FunctionTok"/>
-        </w:rPr>
-        <w:t>grepl</w:t>
-      </w:r>
-      <w:r>
-        <w:rPr>
-          <w:rStyle w:val="NormalTok"/>
-        </w:rPr>
-        <w:t>(</w:t>
-      </w:r>
-      <w:r>
-        <w:rPr>
-          <w:rStyle w:val="StringTok"/>
-        </w:rPr>
-        <w:t>"notapp"</w:t>
-      </w:r>
-      <w:r>
-        <w:rPr>
-          <w:rStyle w:val="NormalTok"/>
-        </w:rPr>
-        <w:t>, .x))</w:t>
-      </w:r>
-      <w:r>
-        <w:br/>
-      </w:r>
-      <w:r>
-        <w:rPr>
-          <w:rStyle w:val="NormalTok"/>
-        </w:rPr>
-        <w:t xml:space="preserve">    ) </w:t>
-      </w:r>
-      <w:r>
-        <w:rPr>
-          <w:rStyle w:val="SpecialCharTok"/>
-        </w:rPr>
-        <w:t>%&gt;%</w:t>
-      </w:r>
-      <w:r>
-        <w:br/>
-      </w:r>
-      <w:r>
-        <w:rPr>
-          <w:rStyle w:val="NormalTok"/>
-        </w:rPr>
         <w:t xml:space="preserve">    tidyr</w:t>
       </w:r>
       <w:r>
@@ -9388,7 +9383,7 @@
         <w:pStyle w:val="Heading3"/>
       </w:pPr>
       <w:bookmarkStart w:id="24" w:name="export-summary-tables"/>
-      <w:bookmarkStart w:id="25" w:name="_Toc230857766"/>
+      <w:bookmarkStart w:id="25" w:name="_Toc232696733"/>
       <w:r>
         <w:t>Export summary tables</w:t>
       </w:r>
@@ -10282,7 +10277,6 @@
         <w:br/>
       </w:r>
       <w:r>
-        <w:lastRenderedPageBreak/>
         <w:br/>
       </w:r>
       <w:r>
@@ -10324,8 +10318,9 @@
         <w:rPr>
           <w:noProof/>
         </w:rPr>
+        <w:lastRenderedPageBreak/>
         <w:drawing>
-          <wp:inline distT="0" distB="0" distL="0" distR="0" wp14:anchorId="442A8571" wp14:editId="2E4E13AC">
+          <wp:inline distT="0" distB="0" distL="0" distR="0" wp14:anchorId="50C9FF51" wp14:editId="7054A5F5">
             <wp:extent cx="4620126" cy="3696101"/>
             <wp:effectExtent l="0" t="0" r="0" b="0"/>
             <wp:docPr id="21" name="Picture"/>
@@ -11040,7 +11035,6 @@
         <w:rPr>
           <w:rStyle w:val="NormalTok"/>
         </w:rPr>
-        <w:lastRenderedPageBreak/>
         <w:t xml:space="preserve">                     </w:t>
       </w:r>
       <w:r>
@@ -11100,10 +11094,11 @@
         <w:pStyle w:val="Heading1"/>
       </w:pPr>
       <w:bookmarkStart w:id="26" w:name="X5501c6844fa53979ffb437bc627e03ded81c587"/>
-      <w:bookmarkStart w:id="27" w:name="_Toc230857767"/>
+      <w:bookmarkStart w:id="27" w:name="_Toc232696734"/>
       <w:bookmarkEnd w:id="22"/>
       <w:bookmarkEnd w:id="24"/>
       <w:r>
+        <w:lastRenderedPageBreak/>
         <w:t>COUNT METHODS (PURELY TAXONOMIC STUDIES EXCLUDED)</w:t>
       </w:r>
       <w:bookmarkEnd w:id="27"/>
@@ -11905,37 +11900,37 @@
         <w:rPr>
           <w:rStyle w:val="NormalTok"/>
         </w:rPr>
+        <w:t>}</w:t>
+      </w:r>
+      <w:r>
+        <w:br/>
+      </w:r>
+      <w:r>
+        <w:br/>
+      </w:r>
+      <w:r>
+        <w:rPr>
+          <w:rStyle w:val="FunctionTok"/>
+        </w:rPr>
+        <w:t>rm</w:t>
+      </w:r>
+      <w:r>
+        <w:rPr>
+          <w:rStyle w:val="NormalTok"/>
+        </w:rPr>
+        <w:t>(col_name, counts)</w:t>
+      </w:r>
+      <w:r>
+        <w:br/>
+      </w:r>
+      <w:r>
+        <w:br/>
+      </w:r>
+      <w:r>
+        <w:rPr>
+          <w:rStyle w:val="NormalTok"/>
+        </w:rPr>
         <w:lastRenderedPageBreak/>
-        <w:t>}</w:t>
-      </w:r>
-      <w:r>
-        <w:br/>
-      </w:r>
-      <w:r>
-        <w:br/>
-      </w:r>
-      <w:r>
-        <w:rPr>
-          <w:rStyle w:val="FunctionTok"/>
-        </w:rPr>
-        <w:t>rm</w:t>
-      </w:r>
-      <w:r>
-        <w:rPr>
-          <w:rStyle w:val="NormalTok"/>
-        </w:rPr>
-        <w:t>(col_name, counts)</w:t>
-      </w:r>
-      <w:r>
-        <w:br/>
-      </w:r>
-      <w:r>
-        <w:br/>
-      </w:r>
-      <w:r>
-        <w:rPr>
-          <w:rStyle w:val="NormalTok"/>
-        </w:rPr>
         <w:t xml:space="preserve">count_results_method </w:t>
       </w:r>
       <w:r>
@@ -12908,7 +12903,7 @@
         </w:rPr>
         <w:lastRenderedPageBreak/>
         <w:drawing>
-          <wp:inline distT="0" distB="0" distL="0" distR="0" wp14:anchorId="04557C3D" wp14:editId="5E8BDFF6">
+          <wp:inline distT="0" distB="0" distL="0" distR="0" wp14:anchorId="7A6F988B" wp14:editId="263C061B">
             <wp:extent cx="4620126" cy="3696101"/>
             <wp:effectExtent l="0" t="0" r="0" b="0"/>
             <wp:docPr id="26" name="Picture"/>
@@ -13652,7 +13647,7 @@
         <w:pStyle w:val="Heading1"/>
       </w:pPr>
       <w:bookmarkStart w:id="28" w:name="count-columns-split"/>
-      <w:bookmarkStart w:id="29" w:name="_Toc230857768"/>
+      <w:bookmarkStart w:id="29" w:name="_Toc232696735"/>
       <w:bookmarkEnd w:id="26"/>
       <w:r>
         <w:t>COUNT COLUMNS SPLIT</w:t>
@@ -16049,7 +16044,7 @@
           <w:noProof/>
         </w:rPr>
         <w:drawing>
-          <wp:inline distT="0" distB="0" distL="0" distR="0" wp14:anchorId="371BDC39" wp14:editId="42DC5A36">
+          <wp:inline distT="0" distB="0" distL="0" distR="0" wp14:anchorId="67C30C27" wp14:editId="40B625E9">
             <wp:extent cx="4620126" cy="3696101"/>
             <wp:effectExtent l="0" t="0" r="0" b="0"/>
             <wp:docPr id="30" name="Picture"/>
@@ -16096,7 +16091,7 @@
         <w:pStyle w:val="Heading1"/>
       </w:pPr>
       <w:bookmarkStart w:id="30" w:name="X94a67b8fc74cc5c021fe2f7f77c3bdbfdc78ab9"/>
-      <w:bookmarkStart w:id="31" w:name="_Toc230857769"/>
+      <w:bookmarkStart w:id="31" w:name="_Toc232696736"/>
       <w:bookmarkEnd w:id="28"/>
       <w:r>
         <w:t>COUNT METHODS (PURELY TAXONOMIC STUDIES EXCLUDED)</w:t>
@@ -18388,7 +18383,7 @@
         </w:rPr>
         <w:lastRenderedPageBreak/>
         <w:drawing>
-          <wp:inline distT="0" distB="0" distL="0" distR="0" wp14:anchorId="1A7DABDA" wp14:editId="623682B1">
+          <wp:inline distT="0" distB="0" distL="0" distR="0" wp14:anchorId="26D92B25" wp14:editId="7458F990">
             <wp:extent cx="4620126" cy="3696101"/>
             <wp:effectExtent l="0" t="0" r="0" b="0"/>
             <wp:docPr id="34" name="Picture"/>
@@ -19114,7 +19109,7 @@
         <w:pStyle w:val="Heading1"/>
       </w:pPr>
       <w:bookmarkStart w:id="32" w:name="publications-per-depth"/>
-      <w:bookmarkStart w:id="33" w:name="_Toc230857770"/>
+      <w:bookmarkStart w:id="33" w:name="_Toc232696737"/>
       <w:bookmarkEnd w:id="30"/>
       <w:r>
         <w:t>PUBLICATIONS PER DEPTH</w:t>
@@ -20303,7 +20298,7 @@
         </w:rPr>
         <w:lastRenderedPageBreak/>
         <w:drawing>
-          <wp:inline distT="0" distB="0" distL="0" distR="0" wp14:anchorId="6040987D" wp14:editId="2926EB99">
+          <wp:inline distT="0" distB="0" distL="0" distR="0" wp14:anchorId="146B0253" wp14:editId="6844EB1D">
             <wp:extent cx="4620126" cy="3696101"/>
             <wp:effectExtent l="0" t="0" r="0" b="0"/>
             <wp:docPr id="38" name="Picture"/>
@@ -20358,7 +20353,7 @@
         <w:pStyle w:val="Heading1"/>
       </w:pPr>
       <w:bookmarkStart w:id="34" w:name="platform-by-depth"/>
-      <w:bookmarkStart w:id="35" w:name="_Toc230857771"/>
+      <w:bookmarkStart w:id="35" w:name="_Toc232696738"/>
       <w:bookmarkEnd w:id="32"/>
       <w:r>
         <w:t>PLATFORM BY DEPTH</w:t>
@@ -30877,7 +30872,7 @@
           <w:noProof/>
         </w:rPr>
         <w:drawing>
-          <wp:inline distT="0" distB="0" distL="0" distR="0" wp14:anchorId="55290D8B" wp14:editId="22F979D8">
+          <wp:inline distT="0" distB="0" distL="0" distR="0" wp14:anchorId="36FCA3E2" wp14:editId="1527E19B">
             <wp:extent cx="4620126" cy="3696101"/>
             <wp:effectExtent l="0" t="0" r="0" b="0"/>
             <wp:docPr id="42" name="Picture"/>
@@ -31381,7 +31376,7 @@
         <w:pStyle w:val="Heading1"/>
       </w:pPr>
       <w:bookmarkStart w:id="36" w:name="direct---indirect-by-decade"/>
-      <w:bookmarkStart w:id="37" w:name="_Toc230857772"/>
+      <w:bookmarkStart w:id="37" w:name="_Toc232696739"/>
       <w:bookmarkEnd w:id="34"/>
       <w:r>
         <w:lastRenderedPageBreak/>
@@ -33569,7 +33564,7 @@
           <w:noProof/>
         </w:rPr>
         <w:drawing>
-          <wp:inline distT="0" distB="0" distL="0" distR="0" wp14:anchorId="57C41FF8" wp14:editId="1A0B5865">
+          <wp:inline distT="0" distB="0" distL="0" distR="0" wp14:anchorId="3606BC3E" wp14:editId="3B70748F">
             <wp:extent cx="4620126" cy="3696101"/>
             <wp:effectExtent l="0" t="0" r="0" b="0"/>
             <wp:docPr id="46" name="Picture"/>
@@ -34073,7 +34068,7 @@
         <w:pStyle w:val="Heading1"/>
       </w:pPr>
       <w:bookmarkStart w:id="38" w:name="field-indicators"/>
-      <w:bookmarkStart w:id="39" w:name="_Toc230857773"/>
+      <w:bookmarkStart w:id="39" w:name="_Toc232696740"/>
       <w:bookmarkEnd w:id="36"/>
       <w:r>
         <w:lastRenderedPageBreak/>
@@ -37794,7 +37789,7 @@
           <w:noProof/>
         </w:rPr>
         <w:drawing>
-          <wp:inline distT="0" distB="0" distL="0" distR="0" wp14:anchorId="404AD25D" wp14:editId="1175120E">
+          <wp:inline distT="0" distB="0" distL="0" distR="0" wp14:anchorId="64346A36" wp14:editId="49DB98C5">
             <wp:extent cx="4620126" cy="3696101"/>
             <wp:effectExtent l="0" t="0" r="0" b="0"/>
             <wp:docPr id="50" name="Picture"/>
@@ -38028,7 +38023,7 @@
         <w:pStyle w:val="Heading2"/>
       </w:pPr>
       <w:bookmarkStart w:id="40" w:name="X55247e60aa52c814ed919bde02b6d19d309f803"/>
-      <w:bookmarkStart w:id="41" w:name="_Toc230857774"/>
+      <w:bookmarkStart w:id="41" w:name="_Toc232696741"/>
       <w:r>
         <w:t>Calculate # of ecological indicators per record</w:t>
       </w:r>
@@ -38683,7 +38678,7 @@
         <w:pStyle w:val="Heading1"/>
       </w:pPr>
       <w:bookmarkStart w:id="42" w:name="sampling-unit"/>
-      <w:bookmarkStart w:id="43" w:name="_Toc230857775"/>
+      <w:bookmarkStart w:id="43" w:name="_Toc232696742"/>
       <w:bookmarkEnd w:id="38"/>
       <w:bookmarkEnd w:id="40"/>
       <w:r>
@@ -38696,7 +38691,7 @@
         <w:pStyle w:val="Heading2"/>
       </w:pPr>
       <w:bookmarkStart w:id="44" w:name="prepare-a-data-frame-for-sampling-unit"/>
-      <w:bookmarkStart w:id="45" w:name="_Toc230857776"/>
+      <w:bookmarkStart w:id="45" w:name="_Toc232696743"/>
       <w:r>
         <w:t>Prepare a data frame for sampling unit</w:t>
       </w:r>
@@ -39410,7 +39405,7 @@
         <w:pStyle w:val="Heading2"/>
       </w:pPr>
       <w:bookmarkStart w:id="46" w:name="calculate-of-sampling-unit-per-record"/>
-      <w:bookmarkStart w:id="47" w:name="_Toc230857777"/>
+      <w:bookmarkStart w:id="47" w:name="_Toc232696744"/>
       <w:bookmarkEnd w:id="44"/>
       <w:r>
         <w:t>Calculate # of sampling unit per record</w:t>
@@ -40245,7 +40240,7 @@
         <w:pStyle w:val="Heading2"/>
       </w:pPr>
       <w:bookmarkStart w:id="48" w:name="simplified-sampling-units"/>
-      <w:bookmarkStart w:id="49" w:name="_Toc230857778"/>
+      <w:bookmarkStart w:id="49" w:name="_Toc232696745"/>
       <w:bookmarkEnd w:id="46"/>
       <w:r>
         <w:t>Simplified sampling units</w:t>
@@ -43636,7 +43631,7 @@
           <w:noProof/>
         </w:rPr>
         <w:drawing>
-          <wp:inline distT="0" distB="0" distL="0" distR="0" wp14:anchorId="53425583" wp14:editId="32D765CC">
+          <wp:inline distT="0" distB="0" distL="0" distR="0" wp14:anchorId="0880A0C6" wp14:editId="49A49249">
             <wp:extent cx="4620126" cy="3696101"/>
             <wp:effectExtent l="0" t="0" r="0" b="0"/>
             <wp:docPr id="57" name="Picture"/>
@@ -44054,7 +44049,7 @@
         <w:pStyle w:val="Heading2"/>
       </w:pPr>
       <w:bookmarkStart w:id="50" w:name="quadrat-extracted-from-transect"/>
-      <w:bookmarkStart w:id="51" w:name="_Toc230857779"/>
+      <w:bookmarkStart w:id="51" w:name="_Toc232696746"/>
       <w:bookmarkEnd w:id="48"/>
       <w:r>
         <w:lastRenderedPageBreak/>
@@ -44435,7 +44430,7 @@
         <w:pStyle w:val="Heading1"/>
       </w:pPr>
       <w:bookmarkStart w:id="52" w:name="data-type"/>
-      <w:bookmarkStart w:id="53" w:name="_Toc230857780"/>
+      <w:bookmarkStart w:id="53" w:name="_Toc232696747"/>
       <w:bookmarkEnd w:id="42"/>
       <w:bookmarkEnd w:id="50"/>
       <w:r>
@@ -46980,7 +46975,7 @@
           <w:noProof/>
         </w:rPr>
         <w:drawing>
-          <wp:inline distT="0" distB="0" distL="0" distR="0" wp14:anchorId="0C690978" wp14:editId="349D0993">
+          <wp:inline distT="0" distB="0" distL="0" distR="0" wp14:anchorId="498CE9DD" wp14:editId="3DF499FA">
             <wp:extent cx="4620126" cy="3696101"/>
             <wp:effectExtent l="0" t="0" r="0" b="0"/>
             <wp:docPr id="63" name="Picture"/>
@@ -47235,7 +47230,7 @@
         <w:pStyle w:val="Heading1"/>
       </w:pPr>
       <w:bookmarkStart w:id="54" w:name="habit"/>
-      <w:bookmarkStart w:id="55" w:name="_Toc230857781"/>
+      <w:bookmarkStart w:id="55" w:name="_Toc232696748"/>
       <w:bookmarkEnd w:id="52"/>
       <w:r>
         <w:t>HABIT</w:t>
@@ -49122,7 +49117,7 @@
         </w:rPr>
         <w:lastRenderedPageBreak/>
         <w:drawing>
-          <wp:inline distT="0" distB="0" distL="0" distR="0" wp14:anchorId="07852319" wp14:editId="19A02FA1">
+          <wp:inline distT="0" distB="0" distL="0" distR="0" wp14:anchorId="6BC3EBBA" wp14:editId="56372B97">
             <wp:extent cx="4620126" cy="3696101"/>
             <wp:effectExtent l="0" t="0" r="0" b="0"/>
             <wp:docPr id="67" name="Picture"/>
@@ -49377,7 +49372,7 @@
         <w:pStyle w:val="Heading1"/>
       </w:pPr>
       <w:bookmarkStart w:id="56" w:name="substrate"/>
-      <w:bookmarkStart w:id="57" w:name="_Toc230857782"/>
+      <w:bookmarkStart w:id="57" w:name="_Toc232696749"/>
       <w:bookmarkEnd w:id="54"/>
       <w:r>
         <w:t>SUBSTRATE</w:t>
@@ -52140,7 +52135,7 @@
           <w:noProof/>
         </w:rPr>
         <w:drawing>
-          <wp:inline distT="0" distB="0" distL="0" distR="0" wp14:anchorId="314FFA26" wp14:editId="643C424B">
+          <wp:inline distT="0" distB="0" distL="0" distR="0" wp14:anchorId="1D9024C9" wp14:editId="3DE00032">
             <wp:extent cx="4620126" cy="3696101"/>
             <wp:effectExtent l="0" t="0" r="0" b="0"/>
             <wp:docPr id="71" name="Picture"/>
@@ -52390,7 +52385,7 @@
         <w:pStyle w:val="Heading1"/>
       </w:pPr>
       <w:bookmarkStart w:id="58" w:name="benthic-position"/>
-      <w:bookmarkStart w:id="59" w:name="_Toc230857783"/>
+      <w:bookmarkStart w:id="59" w:name="_Toc232696750"/>
       <w:bookmarkEnd w:id="56"/>
       <w:r>
         <w:lastRenderedPageBreak/>
@@ -55030,7 +55025,7 @@
         </w:rPr>
         <w:lastRenderedPageBreak/>
         <w:drawing>
-          <wp:inline distT="0" distB="0" distL="0" distR="0" wp14:anchorId="76C823D0" wp14:editId="7712EA54">
+          <wp:inline distT="0" distB="0" distL="0" distR="0" wp14:anchorId="55745B73" wp14:editId="6BE52A15">
             <wp:extent cx="4620126" cy="3696101"/>
             <wp:effectExtent l="0" t="0" r="0" b="0"/>
             <wp:docPr id="75" name="Picture"/>
@@ -55285,7 +55280,7 @@
         <w:pStyle w:val="Heading1"/>
       </w:pPr>
       <w:bookmarkStart w:id="60" w:name="target"/>
-      <w:bookmarkStart w:id="61" w:name="_Toc230857784"/>
+      <w:bookmarkStart w:id="61" w:name="_Toc232696751"/>
       <w:bookmarkEnd w:id="58"/>
       <w:r>
         <w:t>TARGET</w:t>
@@ -55297,7 +55292,7 @@
         <w:pStyle w:val="Heading2"/>
       </w:pPr>
       <w:bookmarkStart w:id="62" w:name="target-level"/>
-      <w:bookmarkStart w:id="63" w:name="_Toc230857785"/>
+      <w:bookmarkStart w:id="63" w:name="_Toc232696752"/>
       <w:r>
         <w:t>Target level</w:t>
       </w:r>
@@ -57186,7 +57181,7 @@
         </w:rPr>
         <w:lastRenderedPageBreak/>
         <w:drawing>
-          <wp:inline distT="0" distB="0" distL="0" distR="0" wp14:anchorId="2BB49DD1" wp14:editId="4B1713CC">
+          <wp:inline distT="0" distB="0" distL="0" distR="0" wp14:anchorId="518C69A1" wp14:editId="12BD2506">
             <wp:extent cx="4620126" cy="3696101"/>
             <wp:effectExtent l="0" t="0" r="0" b="0"/>
             <wp:docPr id="79" name="Picture"/>
@@ -57433,7 +57428,7 @@
         <w:pStyle w:val="Heading2"/>
       </w:pPr>
       <w:bookmarkStart w:id="64" w:name="detected-phyla-in-community-studies"/>
-      <w:bookmarkStart w:id="65" w:name="_Toc230857786"/>
+      <w:bookmarkStart w:id="65" w:name="_Toc232696753"/>
       <w:bookmarkEnd w:id="62"/>
       <w:r>
         <w:t>Detected phyla in community studies</w:t>
@@ -61200,7 +61195,7 @@
           <w:noProof/>
         </w:rPr>
         <w:drawing>
-          <wp:inline distT="0" distB="0" distL="0" distR="0" wp14:anchorId="4F5F4DC7" wp14:editId="1637AEE0">
+          <wp:inline distT="0" distB="0" distL="0" distR="0" wp14:anchorId="7D42215B" wp14:editId="6D069984">
             <wp:extent cx="4620126" cy="3696101"/>
             <wp:effectExtent l="0" t="0" r="0" b="0"/>
             <wp:docPr id="83" name="Picture"/>
@@ -61426,7 +61421,7 @@
         <w:pStyle w:val="Heading2"/>
       </w:pPr>
       <w:bookmarkStart w:id="66" w:name="X73a177f394a82c7a16c80c43727079839a335e0"/>
-      <w:bookmarkStart w:id="67" w:name="_Toc230857787"/>
+      <w:bookmarkStart w:id="67" w:name="_Toc232696754"/>
       <w:bookmarkEnd w:id="64"/>
       <w:r>
         <w:t>Target taxonomic groups not at the community level</w:t>
@@ -65347,7 +65342,7 @@
           <w:noProof/>
         </w:rPr>
         <w:drawing>
-          <wp:inline distT="0" distB="0" distL="0" distR="0" wp14:anchorId="713C8A35" wp14:editId="3A8F145B">
+          <wp:inline distT="0" distB="0" distL="0" distR="0" wp14:anchorId="313C47BA" wp14:editId="70987E43">
             <wp:extent cx="4620126" cy="3696101"/>
             <wp:effectExtent l="0" t="0" r="0" b="0"/>
             <wp:docPr id="87" name="Picture"/>
@@ -65597,7 +65592,7 @@
         <w:pStyle w:val="Heading2"/>
       </w:pPr>
       <w:bookmarkStart w:id="68" w:name="new-species-described-per-phyla"/>
-      <w:bookmarkStart w:id="69" w:name="_Toc230857788"/>
+      <w:bookmarkStart w:id="69" w:name="_Toc232696755"/>
       <w:bookmarkEnd w:id="66"/>
       <w:r>
         <w:t>New species described per phyla</w:t>
@@ -65819,7 +65814,7 @@
         <w:pStyle w:val="Heading1"/>
       </w:pPr>
       <w:bookmarkStart w:id="70" w:name="data-crossing"/>
-      <w:bookmarkStart w:id="71" w:name="_Toc230857789"/>
+      <w:bookmarkStart w:id="71" w:name="_Toc232696756"/>
       <w:bookmarkEnd w:id="60"/>
       <w:bookmarkEnd w:id="68"/>
       <w:r>
@@ -65890,7 +65885,7 @@
         <w:pStyle w:val="Heading2"/>
       </w:pPr>
       <w:bookmarkStart w:id="72" w:name="visually-surveyed-surface"/>
-      <w:bookmarkStart w:id="73" w:name="_Toc230857790"/>
+      <w:bookmarkStart w:id="73" w:name="_Toc232696757"/>
       <w:r>
         <w:t>VISUALLY SURVEYED SURFACE</w:t>
       </w:r>
@@ -66061,7 +66056,7 @@
         <w:pStyle w:val="Heading2"/>
       </w:pPr>
       <w:bookmarkStart w:id="74" w:name="observation"/>
-      <w:bookmarkStart w:id="75" w:name="_Toc230857791"/>
+      <w:bookmarkStart w:id="75" w:name="_Toc232696758"/>
       <w:bookmarkEnd w:id="72"/>
       <w:r>
         <w:t>Observation</w:t>
@@ -66372,7 +66367,7 @@
         <w:pStyle w:val="Heading2"/>
       </w:pPr>
       <w:bookmarkStart w:id="76" w:name="temp-replicates-exp"/>
-      <w:bookmarkStart w:id="77" w:name="_Toc230857792"/>
+      <w:bookmarkStart w:id="77" w:name="_Toc232696759"/>
       <w:bookmarkEnd w:id="74"/>
       <w:r>
         <w:lastRenderedPageBreak/>
@@ -66633,7 +66628,7 @@
         <w:pStyle w:val="Heading2"/>
       </w:pPr>
       <w:bookmarkStart w:id="78" w:name="rov-sample"/>
-      <w:bookmarkStart w:id="79" w:name="_Toc230857793"/>
+      <w:bookmarkStart w:id="79" w:name="_Toc232696760"/>
       <w:bookmarkEnd w:id="76"/>
       <w:r>
         <w:t>ROV &amp; sample</w:t>
@@ -66918,7 +66913,7 @@
         <w:pStyle w:val="Heading2"/>
       </w:pPr>
       <w:bookmarkStart w:id="80" w:name="X767bbcfa4a6d1b30a6803ebb9db6b4db9e4f49c"/>
-      <w:bookmarkStart w:id="81" w:name="_Toc230857794"/>
+      <w:bookmarkStart w:id="81" w:name="_Toc232696761"/>
       <w:bookmarkEnd w:id="78"/>
       <w:r>
         <w:t>Molecular techniques in taxonomic and non-taxonomic studies</w:t>
@@ -67363,7 +67358,7 @@
         <w:pStyle w:val="Heading1"/>
       </w:pPr>
       <w:bookmarkStart w:id="82" w:name="session-information-and-references"/>
-      <w:bookmarkStart w:id="83" w:name="_Toc230857795"/>
+      <w:bookmarkStart w:id="83" w:name="_Toc232696762"/>
       <w:bookmarkEnd w:id="70"/>
       <w:bookmarkEnd w:id="80"/>
       <w:r>
@@ -68239,21 +68234,7 @@
         <w:rPr>
           <w:rStyle w:val="VerbatimChar"/>
         </w:rPr>
-        <w:t>_</w:t>
-      </w:r>
-      <w:proofErr w:type="spellStart"/>
-      <w:r>
-        <w:rPr>
-          <w:rStyle w:val="VerbatimChar"/>
-        </w:rPr>
-        <w:t>dplyr</w:t>
-      </w:r>
-      <w:proofErr w:type="spellEnd"/>
-      <w:r>
-        <w:rPr>
-          <w:rStyle w:val="VerbatimChar"/>
-        </w:rPr>
-        <w:t>: A Grammar</w:t>
+        <w:t>_dplyr: A Grammar</w:t>
       </w:r>
       <w:r>
         <w:br/>
@@ -68414,7 +68395,7 @@
   <w:abstractNum w:abstractNumId="0" w15:restartNumberingAfterBreak="0">
     <w:nsid w:val="0000A990"/>
     <w:multiLevelType w:val="multilevel"/>
-    <w:tmpl w:val="912241D0"/>
+    <w:tmpl w:val="89FC051A"/>
     <w:lvl w:ilvl="0">
       <w:numFmt w:val="bullet"/>
       <w:lvlText w:val=" "/>
@@ -68488,7 +68469,7 @@
       </w:pPr>
     </w:lvl>
   </w:abstractNum>
-  <w:num w:numId="1" w16cid:durableId="246429795">
+  <w:num w:numId="1" w16cid:durableId="267127031">
     <w:abstractNumId w:val="0"/>
   </w:num>
 </w:numbering>
@@ -69747,7 +69728,7 @@
     <w:next w:val="Normal"/>
     <w:autoRedefine/>
     <w:uiPriority w:val="39"/>
-    <w:rsid w:val="00CC105D"/>
+    <w:rsid w:val="001F21E9"/>
     <w:pPr>
       <w:spacing w:after="100"/>
     </w:pPr>
@@ -69758,7 +69739,7 @@
     <w:next w:val="Normal"/>
     <w:autoRedefine/>
     <w:uiPriority w:val="39"/>
-    <w:rsid w:val="00CC105D"/>
+    <w:rsid w:val="001F21E9"/>
     <w:pPr>
       <w:spacing w:after="100"/>
       <w:ind w:left="240"/>
@@ -69770,7 +69751,7 @@
     <w:next w:val="Normal"/>
     <w:autoRedefine/>
     <w:uiPriority w:val="39"/>
-    <w:rsid w:val="00CC105D"/>
+    <w:rsid w:val="001F21E9"/>
     <w:pPr>
       <w:spacing w:after="100"/>
       <w:ind w:left="480"/>
@@ -69780,7 +69761,7 @@
     <w:name w:val="header"/>
     <w:basedOn w:val="Normal"/>
     <w:link w:val="HeaderChar"/>
-    <w:rsid w:val="00CC105D"/>
+    <w:rsid w:val="001F21E9"/>
     <w:pPr>
       <w:tabs>
         <w:tab w:val="center" w:pos="4680"/>
@@ -69793,13 +69774,13 @@
     <w:name w:val="Header Char"/>
     <w:basedOn w:val="DefaultParagraphFont"/>
     <w:link w:val="Header"/>
-    <w:rsid w:val="00CC105D"/>
+    <w:rsid w:val="001F21E9"/>
   </w:style>
   <w:style w:type="paragraph" w:styleId="Footer">
     <w:name w:val="footer"/>
     <w:basedOn w:val="Normal"/>
     <w:link w:val="FooterChar"/>
-    <w:rsid w:val="00CC105D"/>
+    <w:rsid w:val="001F21E9"/>
     <w:pPr>
       <w:tabs>
         <w:tab w:val="center" w:pos="4680"/>
@@ -69812,7 +69793,7 @@
     <w:name w:val="Footer Char"/>
     <w:basedOn w:val="DefaultParagraphFont"/>
     <w:link w:val="Footer"/>
-    <w:rsid w:val="00CC105D"/>
+    <w:rsid w:val="001F21E9"/>
   </w:style>
 </w:styles>
 </file>

</xml_diff>